<commit_message>
Model PRz: koszty pośrednie do Pozostałych kosztów rodzajowych, stawka amortyzacji prac rozwojowych 0%; komentarze PRz z danymi z dokumentów PRz
Co-Authored-By: Claude Sonnet 5.5 <noreply@anthropic.com>
Claude-Session: https://claude.ai/code/session_01672WnJhixnEcarbb7uiwfx
</commit_message>
<xml_diff>
--- a/Komentarze_model_finansowy_PRz.docx
+++ b/Komentarze_model_finansowy_PRz.docx
@@ -15,7 +15,7 @@
         <w:rPr>
           <w:b w:val="0"/>
         </w:rPr>
-        <w:t xml:space="preserve">Wniosek FENG.01.01-IP.01-A1RR/26, CargoDT. Dokument dotyczy wyłącznie modelu Politechniki Rzeszowskiej (plik Model_finansowy_CargoDT_PRz.xlsm, wersja zaakceptowana 06.10.2026 r.). Model Lidera i jego komentarze omówimy w kolejnym kroku. Każdy tekst w części 4 zastępuje cały obecny tekst w polu Komentarz danego arkusza (komórka podana przy nazwie arkusza) i mieści się w limicie 10 000 znaków; liczba znaków jest przy każdym polu. </w:t>
+        <w:t xml:space="preserve">Wniosek FENG.01.01-IP.01-A1RR/26, CargoDT. Dokument dotyczy wyłącznie modelu Politechniki Rzeszowskiej (plik Model_finansowy_CargoDT_PRz.xlsm po zmianach z 06.10.2026 r.: koszty pośrednie przeniesione do Pozostałych kosztów rodzajowych i stawka amortyzacji prac rozwojowych 0%, bez zmiany jakiejkolwiek kwoty). Model Lidera i jego komentarze omówimy w kolejnym kroku. Każdy tekst w części 4 zastępuje cały obecny tekst w polu Komentarz danego arkusza (komórka podana przy nazwie arkusza) i mieści się w limicie 10 000 znaków; liczba znaków jest przy każdym polu. </w:t>
       </w:r>
       <w:r>
         <w:rPr>
@@ -27,7 +27,7 @@
         <w:rPr>
           <w:b w:val="0"/>
         </w:rPr>
-        <w:t xml:space="preserve"> to dane lub potwierdzenia, które może dać tylko PRz albo Ty, albo warianty zależne od Twojej decyzji (część 6). Przed wklejeniem usuń żółte nawiasy i uzupełnij lub usuń zaznaczone zdania. Liczby pochodzą z modelu po przeliczeniu, z wniosku w wersji C (2) z 06.10.2026 r. i ze sprawozdania PRz za 2025 r.</w:t>
+        <w:t xml:space="preserve"> to dane lub potwierdzenia, które może dać tylko PRz albo Ty, albo warianty zależne od Twojej decyzji (część 6). Przed wklejeniem usuń żółte nawiasy i uzupełnij lub usuń zaznaczone zdania. Liczby pochodzą z modelu po przeliczeniu, z wniosku w wersji C (2) z 06.10.2026 r. oraz z dokumentów PRz: sprawozdania za 2025 r. (MSiG nr 86/2026, poz. 21407), planu rzeczowo-finansowego na 2026 r. (zarządzenie Rektora nr 20/2026) i zestawienia amortyzacji.</w:t>
       </w:r>
     </w:p>
     <w:p>
@@ -366,7 +366,7 @@
                 <w:b w:val="0"/>
                 <w:sz w:val="18"/>
               </w:rPr>
-              <w:t>Założenia (okres prognozy), Opłacalność. Uwaga: Instrukcja wymaga trzech lat historycznych, a model ma tylko 2025 r., zob. część 6, decyzja 1</w:t>
+              <w:t>Założenia (okres prognozy), Opłacalność. Model zawiera 2025 r. (uproszczona sprawozdawczość organizacji badawczej; decyzja właścicielki), a dane 2024 r. podano w komentarzu Sprawozdań</w:t>
             </w:r>
           </w:p>
         </w:tc>
@@ -800,22 +800,7 @@
                 <w:b w:val="0"/>
                 <w:sz w:val="18"/>
               </w:rPr>
-              <w:t xml:space="preserve">Przychody (metodyka, struktura </w:t>
-            </w:r>
-            <w:r>
-              <w:rPr>
-                <w:b w:val="0"/>
-                <w:sz w:val="18"/>
-                <w:highlight w:val="yellow"/>
-              </w:rPr>
-              <w:t>do uzupełnienia przez PRz</w:t>
-            </w:r>
-            <w:r>
-              <w:rPr>
-                <w:b w:val="0"/>
-                <w:sz w:val="18"/>
-              </w:rPr>
-              <w:t>), Finansowanie</w:t>
+              <w:t>Przychody (metodyka, struktura planu 2026 r.), Finansowanie</w:t>
             </w:r>
           </w:p>
         </w:tc>
@@ -877,7 +862,7 @@
                 <w:b w:val="0"/>
                 <w:sz w:val="18"/>
               </w:rPr>
-              <w:t>Koszty operacyjne (uwaga o amortyzacji w części 6, decyzja 4)</w:t>
+              <w:t>Koszty operacyjne (amortyzacja w jednej pozycji, zob. część 6)</w:t>
             </w:r>
           </w:p>
         </w:tc>
@@ -1001,7 +986,7 @@
                 <w:b w:val="0"/>
                 <w:sz w:val="18"/>
               </w:rPr>
-              <w:t>Koszty operacyjne (wariant, część 6, decyzja 2)</w:t>
+              <w:t>Koszty operacyjne (koszty pośrednie przeniesione w modelu do Pozostałych kosztów rodzajowych)</w:t>
             </w:r>
           </w:p>
         </w:tc>
@@ -1623,7 +1608,7 @@
                 <w:b w:val="0"/>
                 <w:sz w:val="18"/>
               </w:rPr>
-              <w:t>Sprawozdania finansowe (akapity 2-4): strata minus 3 471 tys. zł wynika ze zmiany stanu produktów minus 16 520 tys. zł; bez niej wynik na sprzedaży wynosi plus 13 049 tys. zł; zysk operacyjny 7 530 tys. zł, brutto 15 176 tys. zł, netto 15 154 tys. zł. Powtórzone krócej w Ocenie kondycji i w Kosztach operacyjnych. Poprzedni komentarz podawał tylko wynik netto, więc luka była realna.</w:t>
+              <w:t>Sprawozdania finansowe (akapity 2-4): strata minus 3 470 tys. zł powstaje po uwzględnieniu zmiany stanu produktów minus 16 520 tys. zł (pozycja stała: minus 11 912 tys. zł w 2024 r., a nie zmiana zapasów, bo stan produktów w bilansie wzrósł); bez niej wynik na sprzedaży wynosi plus 13 049 tys. zł; zysk operacyjny 7 530 tys. zł, brutto 15 176 tys. zł, netto 15 154 tys. zł; dodane dane porównawcze 2024 r. i przepływy 2025 r. Powtórzone krócej w Ocenie kondycji i w Kosztach operacyjnych. Dokładny mechanizm księgowy musi potwierdzić kwestor PRz (żółte pole). Poprzedni komentarz podawał tylko wynik netto, więc luka była realna.</w:t>
             </w:r>
           </w:p>
         </w:tc>
@@ -2045,7 +2030,7 @@
         <w:rPr>
           <w:b w:val="0"/>
         </w:rPr>
-        <w:t xml:space="preserve"> obecny komentarz twierdzi, że brak danych za lata wcześniejsze wynika z „zasad dla organizacji badawczych”. Instrukcja (pkt 5b) wymaga trzech lat historycznych także od organizacji z odzyskiwanym VAT, więc to twierdzenie jest błędne (decyzja 1 w części 6). Nowy tekst go nie powtarza.</w:t>
+        <w:t xml:space="preserve"> obecny komentarz twierdzi, że brak danych za lata wcześniejsze wynika z „zasad dla organizacji badawczych”. Nowy tekst go nie powtarza: podaje, że model zawiera ostatni zamknięty rok sprawozdawczy zgodnie z uproszczoną sprawozdawczością organizacji badawczej, i dodaje dane porównawcze 2024 r. z tego samego sprawozdania.</w:t>
       </w:r>
     </w:p>
     <w:p>
@@ -2062,7 +2047,7 @@
         <w:rPr>
           <w:b w:val="0"/>
         </w:rPr>
-        <w:t xml:space="preserve"> obecny komentarz mówi, że amortyzację aparatury ujęto w kosztach „bezpośrednio” z powodu „zasady rachunkowości, według której majątek sfinansowany z dotacji i przyjęty po zakończeniu badań podlega amortyzacji jednorazowej, a jej równowartość odpisywana jest w przychody operacyjne”. Nie znajduje to potwierdzenia we wniosku, który podaje inną podstawę: jednorazowy odpis składników do 10 tys. zł netto w miesiącu oddania do używania. Obecny komentarz podaje też, że koszty dotychczasowej działalności są „łącznie z amortyzacją” bez wskazania, że Instrukcja każe amortyzację wyodrębniać.</w:t>
+        <w:t xml:space="preserve"> obecny komentarz mówi, że amortyzację aparatury ujęto w kosztach „bezpośrednio” z powodu „zasady rachunkowości, według której majątek sfinansowany z dotacji i przyjęty po zakończeniu badań podlega amortyzacji jednorazowej, a jej równowartość odpisywana jest w przychody operacyjne”. Nie znajduje to potwierdzenia we wniosku, który podaje inną podstawę: jednorazowy odpis składników do 10 tys. zł netto w miesiącu oddania do używania. Poprzedni komentarz podawał też ogólnie, że plan 2026 r. to 376 371 tys. zł, bez struktury kosztów; nowy podaje strukturę z planu (w tym amortyzację 26 546,6 tys. zł) i wyjaśnia wzrost względem 2025 r.</w:t>
       </w:r>
     </w:p>
     <w:p>
@@ -2183,7 +2168,7 @@
           <w:color w:val="666666"/>
           <w:sz w:val="17"/>
         </w:rPr>
-        <w:t xml:space="preserve"> [3967 znaków]</w:t>
+        <w:t xml:space="preserve"> [4303 znaków]</w:t>
       </w:r>
     </w:p>
     <w:p>
@@ -2194,7 +2179,7 @@
         <w:rPr>
           <w:b w:val="0"/>
         </w:rPr>
-        <w:t>Model dotyczy Politechniki Rzeszowskiej im. Ignacego Łukasiewicza (PRz), konsorcjanta w projekcie CargoDT. Wypełniono go jako model organizacji badawczej z prawną możliwością odzyskania podatku VAT (płatnik VAT: tak) i ze sprawozdawczością uproszczoną, zgodnie z pkt 5b Instrukcji. Dane podano w tysiącach złotych, w kwotach netto i w cenach stałych, bez uwzględniania inflacji (pkt 8, 12 i 14 Instrukcji). Rok obrotowy PRz trwa 12 miesięcy i jest równy kalendarzowemu (pkt 7). Bieżący rok obrotowy rozpoczyna się 1.01.2026 r. (komórka C12). Komórkę C14 pozostawiono pustą, a kolumnę F w arkuszu Sprawozdania finansowe nie wypełniono, ponieważ PRz ma sprawozdanie za zamknięty rok 2025 (zatwierdzone uchwałą Rady Uczelni nr 10/2026 z 20.04.2026 r.), a Instrukcja dla organizacji badawczych każe w takim przypadku pozostawić te pola puste (pkt 6).</w:t>
+        <w:t>Model dotyczy Politechniki Rzeszowskiej im. Ignacego Łukasiewicza (PRz), konsorcjanta w projekcie CargoDT. Wypełniono go jako model organizacji badawczej z prawną możliwością odzyskania podatku VAT (płatnik VAT: tak) i ze sprawozdawczością uproszczoną, zgodnie z pkt 5b Instrukcji. Dane podano w tysiącach złotych, w kwotach netto i w cenach stałych, bez uwzględniania inflacji (pkt 8, 12 i 14 Instrukcji). Rok obrotowy PRz trwa 12 miesięcy i jest równy kalendarzowemu (pkt 7). Bieżący rok obrotowy rozpoczyna się 1.01.2026 r. (komórka C12). Komórkę C14 pozostawiono pustą, a kolumnę F w arkuszu Sprawozdania finansowe nie wypełniono, ponieważ PRz ma sprawozdanie za zamknięty rok 2025 (zbadane przez biegłego rewidenta, zatwierdzone uchwałą Rady Uczelni nr 10/2026 z 20.04.2026 r. i ogłoszone w Monitorze Sądowym i Gospodarczym nr 86 (7491) z 6.05.2026 r., poz. 21407), a Instrukcja dla organizacji badawczych każe w takim przypadku pozostawić te pola puste (pkt 6).</w:t>
       </w:r>
     </w:p>
     <w:p>
@@ -2216,7 +2201,7 @@
         <w:rPr>
           <w:b w:val="0"/>
         </w:rPr>
-        <w:t>Dane PRz obejmują lata historyczne (sprawozdanie za 2025 r.), rok bieżący 2026 oraz lata realizacji projektu 2026-2029. Zgodnie z pkt 5b Instrukcji organizacje badawcze nie wprowadzają danych na okres po zakończeniu realizacji projektu, dlatego dane PRz kończą się w 2029 r., a ewentualne wartości w kolumnach od 2030 r. w arkuszach wynikowych nie są prognozą PRz i nie oznaczają założenia o zakończeniu jej działalności. Pole „Okres prognozy” (5 lat, rok 2034 w komórce C21) jest parametrem technicznym modelu. Lider przyjął dłuższy okres prognozy (do 2039 r.), więc warunek Instrukcji, że okres prognozy Lidera nie może być krótszy od okresu wskazanego przez członka konsorcjum, jest spełniony.</w:t>
+        <w:t>Dane PRz obejmują ostatni zamknięty rok sprawozdawczy (2025 r., zgodnie z uproszczoną sprawozdawczością organizacji badawczej), rok bieżący 2026 oraz lata realizacji projektu 2026-2029. Dane porównawcze za 2024 r. z tego samego sprawozdania podano w komentarzu do arkusza Sprawozdania finansowe. Zgodnie z pkt 5b Instrukcji organizacje badawcze nie wprowadzają danych na okres po zakończeniu realizacji projektu, dlatego dane PRz kończą się w 2029 r., a ewentualne wartości w kolumnach od 2030 r. w arkuszach wynikowych nie są prognozą PRz i nie oznaczają założenia o zakończeniu jej działalności. Pole „Okres prognozy” (5 lat, rok 2034 w komórce C21) jest parametrem technicznym modelu. Lider przyjął dłuższy okres prognozy (do 2039 r.), więc warunek Instrukcji, że okres prognozy Lidera nie może być krótszy od okresu wskazanego przez członka konsorcjum, jest spełniony.</w:t>
       </w:r>
     </w:p>
     <w:p>
@@ -2273,7 +2258,7 @@
         <w:rPr>
           <w:b w:val="0"/>
         </w:rPr>
-        <w:t>Średnie stawki amortyzacji (komórki C46-C53) pozostawiono puste, ponieważ koszty dotychczasowej działalności wprowadzono zbiorczo, wraz z amortyzacją, w jednej pozycji arkusza Koszty operacyjne, a wartość majątku trwałego dotychczasowej działalności utrzymano w prognozie na poziomie z 31.12.2025 r. (zob. komentarz do arkusza Środki trwałe). Pola oprocentowania (komórki C60-C72) są puste, bo PRz nie ma kredytów ani pożyczek, nie planuje depozytów bankowych, a przychody finansowe wchodzą do zbiorczej pozycji przychodów (zob. komentarz do arkusza Przychody). Stawki amortyzacji nie dotyczą też aparatury projektu: odpisuje się ją jednorazowo, co opisano w komentarzach do arkuszy Koszty operacyjne i Środki trwałe.</w:t>
+        <w:t>Średnie stawki amortyzacji (komórki C46-C53) pozostawiono puste, ponieważ koszty dotychczasowej działalności wprowadzono zbiorczo, wraz z amortyzacją (26 546,6 tys. zł w planie na 2026 r.), w jednej pozycji arkusza Koszty operacyjne, a wartość majątku trwałego dotychczasowej działalności utrzymano w prognozie na poziomie z 31.12.2025 r. (zob. komentarz do arkusza Środki trwałe). Pola oprocentowania (komórki C60-C72) są puste, bo PRz nie ma kredytów ani pożyczek, nie planuje depozytów bankowych, a przychody finansowe wchodzą do zbiorczej pozycji przychodów (zob. komentarz do arkusza Przychody). Stawki amortyzacji nie dotyczą też aparatury projektu: odpisuje się ją jednorazowo, co opisano w komentarzach do arkuszy Koszty operacyjne i Środki trwałe.</w:t>
       </w:r>
     </w:p>
     <w:p>
@@ -2301,7 +2286,7 @@
           <w:color w:val="666666"/>
           <w:sz w:val="17"/>
         </w:rPr>
-        <w:t xml:space="preserve"> [5294 znaków]</w:t>
+        <w:t xml:space="preserve"> [6364 znaków]</w:t>
       </w:r>
     </w:p>
     <w:p>
@@ -2312,7 +2297,7 @@
         <w:rPr>
           <w:b w:val="0"/>
         </w:rPr>
-        <w:t>Dane za 2025 r. pochodzą ze sprawozdania finansowego PRz zatwierdzonego uchwałą Rady Uczelni nr 10/2026 z 20.04.2026 r. i są podane w tysiącach złotych. Możliwe są różnice rzędu ±1 tys. zł wynikające z zaokrągleń pozycji (pkt 11 Instrukcji). Zysk netto za 2025 r. wyniósł 15 154 851,78 zł (15 154 tys. zł).</w:t>
+        <w:t>Dane za 2025 r. pochodzą ze sprawozdania finansowego PRz za rok 2025, zbadanego przez biegłego rewidenta, zatwierdzonego uchwałą Rady Uczelni nr 10/2026 z 20.04.2026 r. i ogłoszonego w Monitorze Sądowym i Gospodarczym nr 86 (7491) z 6.05.2026 r., poz. 21407. Dane w tabeli podano w tysiącach złotych, więc możliwe są różnice rzędu ±1 tys. zł wynikające z zaokrągleń (pkt 11 Instrukcji). Zysk netto za 2025 r. wyniósł 15 154 851,78 zł. Model zawiera ostatni zamknięty rok sprawozdawczy, zgodnie z uproszczoną sprawozdawczością organizacji badawczej, a dane porównawcze za 2024 r. z tego samego sprawozdania podano poniżej w komentarzu.</w:t>
       </w:r>
     </w:p>
     <w:p>
@@ -2323,7 +2308,7 @@
         <w:rPr>
           <w:b w:val="0"/>
         </w:rPr>
-        <w:t>Rachunek zysków i strat (wariant porównawczy) za 2025 r.: przychody netto ze sprzedaży i zrównane z nimi wyniosły 342 752 tys. zł, w tym przychody netto ze sprzedaży produktów 359 188 tys. zł, zmiana stanu produktów minus 16 520 tys. zł, koszt wytworzenia produktów na własne potrzeby 64 tys. zł i przychody ze sprzedaży towarów i materiałów 20 tys. zł. Koszty działalności operacyjnej wyniosły 346 223 tys. zł: wynagrodzenia 215 107 tys. zł (62%), ubezpieczenia społeczne i inne świadczenia 55 368 tys. zł (16%), zużycie materiałów i energii 25 666 tys. zł (7%), amortyzacja 22 670 tys. zł (7%), usługi obce 13 101 tys. zł (4%), pozostałe koszty rodzajowe 12 534 tys. zł (4%), podatki i opłaty 1 690 tys. zł (0,5%) i wartość sprzedanych towarów i materiałów 87 tys. zł.</w:t>
+        <w:t>Rachunek zysków i strat (wariant porównawczy) za 2025 r. (w nawiasach 2024 r.): przychody netto ze sprzedaży i zrównane z nimi 342 752 tys. zł (317 386), w tym przychody netto ze sprzedaży produktów 359 188 tys. zł (329 295), zmiana stanu produktów minus 16 520 tys. zł (minus 11 912), koszt wytworzenia produktów na własne potrzeby 64 tys. zł i przychody ze sprzedaży towarów 20 tys. zł (2 043 w 2024 r.). Koszty działalności operacyjnej wyniosły 346 223 tys. zł (317 373): wynagrodzenia 215 107 tys. zł (62%), ubezpieczenia społeczne i inne świadczenia 55 368 tys. zł (16%), zużycie materiałów i energii 25 666 tys. zł (7%), amortyzacja 22 670 tys. zł (7%), usługi obce 13 101 tys. zł (4%), pozostałe koszty rodzajowe 12 534 tys. zł (4%), podatki i opłaty 1 690 tys. zł (0,5%) i wartość sprzedanych towarów 87 tys. zł. Przychody wzrosły o 8,0%, a koszty o 9,1%.</w:t>
       </w:r>
     </w:p>
     <w:p>
@@ -2334,20 +2319,20 @@
         <w:rPr>
           <w:b w:val="0"/>
         </w:rPr>
-        <w:t xml:space="preserve">Strata na sprzedaży w 2025 r. (minus 3 471 tys. zł) wynika wprost ze zmiany stanu produktów, czyli z wyniku, który w wariancie porównawczym pomniejsza przychody netto o 16 520 tys. zł. Bez tej pozycji wynik na sprzedaży wyniósłby plus 13 049 tys. zł (359 188 + 64 + 20 - 346 223), więc podstawowa sprzedaż pokrywa koszty z nadwyżką. Ujemna zmiana stanu produktów oznacza, że w 2025 r. zmniejszył się stan produktów w toku i gotowych, co w jednostce prowadzącej projekty badawcze odpowiada rozliczeniu produktów (prac i usług), których koszty wytworzenia ujęto w kosztach rodzajowych w latach wcześniejszych. Stan produktów w toku i gotowych na 31.12.2025 r. wynosi 3 329 tys. zł (3 306 + 23), więc przy pełnym przełożeniu tej zmiany na stan bilansowy na koniec 2024 r. był równy około 19 849 tys. zł. </w:t>
+        <w:t xml:space="preserve">Strata na sprzedaży w 2025 r. (minus 3 470 tys. zł) powstaje po uwzględnieniu w wariancie porównawczym zmiany stanu produktów, która pomniejsza przychody netto o 16 520 tys. zł. Bez tej pozycji wynik na sprzedaży wyniósłby plus 13 049 tys. zł (359 188 + 64 + 20 - 346 223), czyli sprzedaż produktów i usług z nadwyżką pokrywa koszty rodzajowe. Zmiana stanu produktów jest w PRz pozycją stałą, a nie jednorazową: wyniosła minus 11 912 tys. zł także w 2024 r., kiedy wynik na sprzedaży był bliski zera (plus 12 tys. zł). Nie jest to zmiana zapasów widoczna w bilansie (stan produktów w toku i gotowych wzrósł z 2 259 do 3 329 tys. zł), tylko element sposobu ewidencji kosztów i przychodów w PRz: koszty rodzajowe (zespół kont 4) są rozliczane na koszty działalności podstawowej w układzie kalkulacyjnym (zespół kont 5) według działalności dydaktycznej i naukowo-badawczej oraz poszczególnych projektów, a rachunek zysków i strat jest sporządzany w wariancie porównawczym (zasady rachunkowości PRz opisane w sprawozdaniu). </w:t>
       </w:r>
       <w:r>
         <w:rPr>
           <w:b w:val="0"/>
           <w:highlight w:val="yellow"/>
         </w:rPr>
-        <w:t>PRz potwierdza, że przyczyną zmiany stanu produktów jest rozliczenie w 2025 r. projektów i prac wytworzonych w latach wcześniejszych, i podaje ich rodzaj</w:t>
+        <w:t>PRz (kwestor) potwierdza i krótko opisuje, co składa się na zmianę stanu produktów minus 16 520 tys. zł w 2025 r. i minus 11 912 tys. zł w 2024 r.</w:t>
       </w:r>
       <w:r>
         <w:rPr>
           <w:b w:val="0"/>
         </w:rPr>
-        <w:t xml:space="preserve"> Strata na sprzedaży nie przekłada się na stratę brutto ani netto: pozostałe przychody operacyjne wyniosły 11 555 tys. zł (dotacje 10 134 tys. zł, zysk ze zbycia aktywów trwałych 129 tys. zł, inne 1 292 tys. zł), pozostałe koszty operacyjne 554 tys. zł, więc zysk z działalności operacyjnej to 7 530 tys. zł. Przychody finansowe wyniosły 7 855 tys. zł (odsetki 7 315 tys. zł, inne 540 tys. zł), a koszty finansowe 209 tys. zł (odsetki 1 tys. zł). Zysk brutto to 15 176 tys. zł, podatek dochodowy 22 tys. zł, a zysk netto 15 154 tys. zł, czyli 4,4% przychodów netto ze sprzedaży.</w:t>
+        <w:t xml:space="preserve"> Strata na sprzedaży nie przekłada się na stratę brutto ani netto, bo pozostałe przychody operacyjne wyniosły 11 555 tys. zł (dotacje 10 134 tys. zł, zysk ze zbycia aktywów trwałych 129 tys. zł, inne 1 292 tys. zł), a pozostałe koszty operacyjne 554 tys. zł, więc zysk z działalności operacyjnej wynosi 7 530 tys. zł. Przychody finansowe wyniosły 7 855 tys. zł (odsetki 7 315 tys. zł, inne 540 tys. zł), koszty finansowe 209 tys. zł (odsetki 1 tys. zł), zysk brutto 15 176 tys. zł, podatek dochodowy 22 tys. zł, a zysk netto 15 154 tys. zł, czyli 4,4% przychodów netto ze sprzedaży.</w:t>
       </w:r>
     </w:p>
     <w:p>
@@ -2358,7 +2343,20 @@
         <w:rPr>
           <w:b w:val="0"/>
         </w:rPr>
-        <w:t>Pozycje, które istotnie wpływają na wynik 2025 r. i nie muszą się powtarzać w takiej skali: odsetki od środków pieniężnych i lokat (7 315 tys. zł, czyli połowa zysku netto), dotacje ujęte w pozostałych przychodach operacyjnych (10 134 tys. zł) oraz zmiana stanu produktów (minus 16 520 tys. zł). Prognoza z arkuszy Przychody i Koszty operacyjne nie zakłada żadnej z tych pozycji osobno, tylko zbiorcze przychody i koszty z planu na 2026 r., co opisano w komentarzach do tych arkuszy.</w:t>
+        <w:t xml:space="preserve">Różnice względem 2024 r. i pozycje jednorazowe. W 2024 r. zysk z działalności operacyjnej wynosił 31 790 tys. zł, a zysk netto 37 077 tys. zł. Spadek wyniku w 2025 r. wynika głównie z niższych innych przychodów operacyjnych (1 292 tys. zł wobec 23 988 tys. zł w 2024 r.) oraz z tego, że koszty wzrosły szybciej niż przychody; dotacje w pozostałych przychodach operacyjnych wzrosły z 8 398 do 10 134 tys. zł. </w:t>
+      </w:r>
+      <w:r>
+        <w:rPr>
+          <w:b w:val="0"/>
+          <w:highlight w:val="yellow"/>
+        </w:rPr>
+        <w:t>PRz wyjaśnia, co złożyło się na inne przychody operacyjne 2024 r. (23 988 tys. zł)</w:t>
+      </w:r>
+      <w:r>
+        <w:rPr>
+          <w:b w:val="0"/>
+        </w:rPr>
+        <w:t xml:space="preserve"> Pozycje istotne dla wyniku 2025 r. to odsetki od środków pieniężnych i lokat (7 315 tys. zł, czyli 48% zysku netto; w 2024 r. 5 593 tys. zł), dotacje (10 134 tys. zł) i zmiana stanu produktów. Prognoza z arkuszy Przychody i Koszty operacyjne nie wyodrębnia ich, tylko przyjmuje zbiorcze przychody i koszty z planu rzeczowo-finansowego na 2026 r. (komentarze do tych arkuszy).</w:t>
       </w:r>
     </w:p>
     <w:p>
@@ -2369,7 +2367,7 @@
         <w:rPr>
           <w:b w:val="0"/>
         </w:rPr>
-        <w:t>Bilans na 31.12.2025 r.: aktywa razem 525 239 tys. zł. Aktywa trwałe (350 933 tys. zł) to głównie rzeczowe aktywa trwałe 309 405 tys. zł (budynki i budowle 245 874 tys. zł, urządzenia i maszyny 35 729 tys. zł, grunty 8 246 tys. zł, środki trwałe w budowie 18 075 tys. zł, środki transportu 984 tys. zł, inne 497 tys. zł), inwestycje długoterminowe 40 445 tys. zł (głównie papiery wartościowe 40 421 tys. zł) i wartości niematerialne 1 066 tys. zł. Aktywa obrotowe (174 306 tys. zł) to środki pieniężne 157 378 tys. zł, należności 10 040 tys. zł, zapasy 5 759 tys. zł i rozliczenia międzyokresowe 1 129 tys. zł. Kapitał własny wynosi 354 572 tys. zł (kapitał podstawowy 339 418 tys. zł i zysk netto 15 154 tys. zł), co daje 67,5% sumy bilansowej. Zobowiązania i rezerwy (170 667 tys. zł) to rezerwy 58 182 tys. zł (w tym na świadczenia emerytalne 45 921 tys. zł), zobowiązania krótkoterminowe 57 148 tys. zł (dostawy i usługi 7 871 tys. zł, podatki i świadczenia 15 582 tys. zł, wynagrodzenia 11 231 tys. zł, inne 2 591 tys. zł, fundusze specjalne 19 873 tys. zł), zobowiązania długoterminowe 392 tys. zł oraz rozliczenia międzyokresowe bierne z tytułu dotacji 54 945 tys. zł (23 947 tys. zł długoterminowe i 30 998 tys. zł krótkoterminowe). PRz nie ma kredytów ani pożyczek.</w:t>
+        <w:t>Bilans na 31.12.2025 r. (w nawiasach 31.12.2024 r.): aktywa razem 525 239 tys. zł (489 122). Aktywa trwałe (350 933 tys. zł) to głównie rzeczowe aktywa trwałe 309 405 tys. zł (budynki i budowle 245 874 tys. zł, urządzenia i maszyny 35 729 tys. zł, grunty 8 246 tys. zł, środki trwałe w budowie 18 075 tys. zł, środki transportu 984 tys. zł, inne 497 tys. zł), inwestycje długoterminowe 40 445 tys. zł (głównie papiery wartościowe 40 421 tys. zł) i wartości niematerialne 1 066 tys. zł. Aktywa obrotowe (174 306 tys. zł) to środki pieniężne 157 378 tys. zł (125 431), należności 10 040 tys. zł, zapasy 5 759 tys. zł i rozliczenia międzyokresowe 1 129 tys. zł. Kapitał własny wynosi 354 572 tys. zł (339 956), czyli 67,5% sumy bilansowej (kapitał podstawowy 339 418 tys. zł i zysk netto 15 154 tys. zł). Zobowiązania i rezerwy (170 667 tys. zł) to rezerwy 58 182 tys. zł (w tym na świadczenia emerytalne 45 921 tys. zł), zobowiązania krótkoterminowe 57 148 tys. zł (dostawy i usługi 7 871 tys. zł, podatki i świadczenia 15 582 tys. zł, wynagrodzenia 11 231 tys. zł, inne 2 591 tys. zł, fundusze specjalne 19 873 tys. zł), zobowiązania długoterminowe 392 tys. zł oraz rozliczenia międzyokresowe bierne z tytułu dotacji 54 945 tys. zł (23 947 tys. zł długoterminowe i 30 998 tys. zł krótkoterminowe). PRz nie ma kredytów ani pożyczek.</w:t>
       </w:r>
     </w:p>
     <w:p>
@@ -2380,7 +2378,7 @@
         <w:rPr>
           <w:b w:val="0"/>
         </w:rPr>
-        <w:t>Okres bieżący: zgodnie z pkt 6 Instrukcji, ponieważ PRz ma sprawozdanie za zamknięty rok obrotowy 2025, kolumna danych bieżących (F) nie jest wypełniona. Prognoza na lata 2026-2029 wynika z planu finansowo-rzeczowego PRz na 2026 r. i stałego tempa wzrostu 4% rocznie (komentarze do arkuszy Przychody i Koszty operacyjne), a jej wynik jest bliski zeru (zysk netto 1 909 tys. zł w 2026 r., czyli 0,5% przychodów), w odróżnieniu od 2025 r., na który złożyły się wysokie odsetki i dotacje.</w:t>
+        <w:t>Przepływy pieniężne 2025 r. według sprawozdania: działalność operacyjna plus 45 194 tys. zł, inwestycyjna minus 28 418 tys. zł (nabycie aktywów trwałych 30 532 tys. zł), finansowa plus 15 171 tys. zł, przepływy netto plus 31 948 tys. zł, a środki pieniężne wzrosły ze 125 431 do 157 378 tys. zł, z czego 3 071 tys. zł ma ograniczoną możliwość dysponowania.</w:t>
       </w:r>
     </w:p>
     <w:p>
@@ -2390,9 +2388,8 @@
       <w:r>
         <w:rPr>
           <w:b w:val="0"/>
-          <w:highlight w:val="yellow"/>
         </w:rPr>
-        <w:t>Wariant do wklejenia tylko po uzupełnieniu danych za 2023 i 2024 r. w arkuszu: Dane za lata 2023 i 2024 pochodzą ze sprawozdań finansowych zatwierdzonych uchwałami Rady Uczelni nr [numer] z dnia [data] i nr [numer] z dnia [data]. Przychody netto ze sprzedaży wyniosły [kwota] tys. zł w 2023 r. i [kwota] tys. zł w 2024 r., a zysk netto [kwota] tys. zł i [kwota] tys. zł. Zmiana wyniku w 2025 r. wobec lat poprzednich wynika z [przyczyna].</w:t>
+        <w:t>Okres bieżący: zgodnie z pkt 6 Instrukcji, ponieważ PRz ma sprawozdanie za zamknięty rok obrotowy 2025, kolumna danych bieżących (F) nie jest wypełniona. Prognoza na lata 2026-2029 wynika z planu rzeczowo-finansowego PRz na 2026 r. (zarządzenie Rektora nr 20/2026 z 21.04.2026 r.) i stałego tempa wzrostu 4% rocznie (komentarze do arkuszy Przychody i Koszty operacyjne). Jej wynik jest bliski zeru (zysk netto w modelu 1 909 tys. zł w 2026 r., 0,5% przychodów; w planie 1 724,9 tys. zł), w odróżnieniu od 2025 r., na który złożyły się wysokie odsetki i dotacje.</w:t>
       </w:r>
     </w:p>
     <w:p>
@@ -2420,7 +2417,7 @@
           <w:color w:val="666666"/>
           <w:sz w:val="17"/>
         </w:rPr>
-        <w:t xml:space="preserve"> [3688 znaków]</w:t>
+        <w:t xml:space="preserve"> [4379 znaków]</w:t>
       </w:r>
     </w:p>
     <w:p>
@@ -2431,7 +2428,7 @@
         <w:rPr>
           <w:b w:val="0"/>
         </w:rPr>
-        <w:t>Przychody dotychczasowej działalności PRz ujęto zbiorczo w jednej pozycji (subwencja, dotacje na działalność statutową, opłaty za kształcenie, przychody z projektów badawczych, pozostałe przychody operacyjne i przychody finansowe), z ilością równą 1 i ceną równą wartości przychodu. Instrukcja dopuszcza taki sposób dla organizacji badawczych z prawną możliwością odzyskania VAT (agregacja danych ze wszystkich źródeł). Z tego powodu pozycje „Pozostałe przychody operacyjne” i „Przychody finansowe” w prognozie są zerowe: ich odpowiedniki są zawarte w pozycji zbiorczej.</w:t>
+        <w:t>Przychody dotychczasowej działalności PRz ujęto zbiorczo w jednej pozycji (subwencja, dotacje, opłaty za kształcenie, przychody z projektów badawczych i usług, pozostałe przychody operacyjne i przychody finansowe), z ilością równą 1 i ceną równą wartości przychodu. Instrukcja dopuszcza taki sposób dla organizacji badawczych z prawną możliwością odzyskania VAT (agregacja danych ze wszystkich źródeł). Z tego powodu pozycje „Pozostałe przychody operacyjne” i „Przychody finansowe” w prognozie są zerowe: ich odpowiedniki są zawarte w pozycji zbiorczej.</w:t>
       </w:r>
     </w:p>
     <w:p>
@@ -2442,20 +2439,7 @@
         <w:rPr>
           <w:b w:val="0"/>
         </w:rPr>
-        <w:t xml:space="preserve">Metodyka prognozy. Bazą jest plan finansowo-rzeczowy PRz na 2026 r. </w:t>
-      </w:r>
-      <w:r>
-        <w:rPr>
-          <w:b w:val="0"/>
-          <w:highlight w:val="yellow"/>
-        </w:rPr>
-        <w:t>PRz podaje numer i datę uchwały zatwierdzającej plan</w:t>
-      </w:r>
-      <w:r>
-        <w:rPr>
-          <w:b w:val="0"/>
-        </w:rPr>
-        <w:t>: przychody z działalności operacyjnej 371 780 tys. zł oraz planowane przychody finansowe 6 500 tys. zł, razem 378 280 tys. zł. Przychody w kolejnych latach rosną o 4% rocznie, czyli o stopę dyskonta przyjętą w modelu, co Instrukcja dopuszcza dla organizacji badawczych, i wynoszą: 393 411 tys. zł w 2027 r., 409 148 tys. zł w 2028 r. i 425 514 tys. zł w 2029 r. Prognozę sporządzono w cenach stałych, więc wzrost 4% nie jest inflacją, tylko uproszczonym odzwierciedleniem rozwoju skali działalności uczelni.</w:t>
+        <w:t>Metodyka prognozy. Bazą jest plan rzeczowo-finansowy PRz na 2026 r., zmieniony zarządzeniem Rektora nr 20/2026 z 21.04.2026 r. po pozytywnej opinii Rady Uczelni (pierwotny plan: zarządzenie nr 103/2025 z 19.12.2025 r.). Przychody z działalności operacyjnej wynoszą 371 780,4 tys. zł, a przychody finansowe 6 500,0 tys. zł (w tym odsetki 6 400,0 tys. zł), razem 378 280 tys. zł. Przychody w kolejnych latach rosną o 4% rocznie, czyli o stopę dyskonta przyjętą w modelu, co Instrukcja dopuszcza dla organizacji badawczych, i wynoszą: 393 411 tys. zł w 2027 r., 409 148 tys. zł w 2028 r. i 425 514 tys. zł w 2029 r. Prognozę sporządzono w cenach stałych, więc wzrost 4% nie jest inflacją, tylko uproszczonym odzwierciedleniem rozwoju skali działalności uczelni.</w:t>
       </w:r>
     </w:p>
     <w:p>
@@ -2466,7 +2450,7 @@
         <w:rPr>
           <w:b w:val="0"/>
         </w:rPr>
-        <w:t>Ciągłość z danymi historycznymi. Plan na 2026 r. (378 280 tys. zł) obejmuje także pozycje, które w sprawozdaniu za 2025 r. leżą poniżej zysku ze sprzedaży: pozostałe przychody operacyjne (11 555 tys. zł) i przychody finansowe (7 855 tys. zł). Porównywalna wartość z 2025 r. to 362 162 tys. zł (przychody netto ze sprzedaży 342 752 + 11 555 + 7 855), więc plan jest o 4,4% wyższy. Jeśli z danych 2025 r. wyłączyć ujemną zmianę stanu produktów (minus 16 520 tys. zł, zob. komentarz do arkusza Sprawozdania finansowe), porównywalna wartość wynosi 378 682 tys. zł, a plan na 2026 r. jest od niej niższy o 0,1%. Prognoza nie zakłada więc istotnego wzrostu ani spadku przychodów względem faktycznej skali sprzedaży z 2025 r., a tempo 4% rocznie w latach 2027-2029 jest zgodne z Instrukcją. Z tego powodu wskaźniki rentowności sprzedaży w prognozie nie są bezpośrednio porównywalne z 2025 r., bo przychody ze sprzedaży w prognozie zawierają pozycje, które w 2025 r. wykazano osobno.</w:t>
+        <w:t>Struktura przychodów planu na 2026 r. (371 780,4 tys. zł): subwencja na utrzymanie potencjału dydaktycznego i badawczego 281 491,8 tys. zł (75,7%), opłaty za usługi edukacyjne 22 594,8 tys. zł (6,1%), pozostałe przychody z podstawowej działalności operacyjnej 24 100,0 tys. zł (6,5%, w tym opłaty za domy i stołówki studenckie 7 533,0 tys. zł), środki na przedsięwzięcia współfinansowane ze źródeł zagranicznych, niepodlegające zwrotowi, 12 813,6 tys. zł (3,4%), dotacje z budżetu państwa 10 108,2 tys. zł (2,7%), pozostałe przychody operacyjne 9 696,6 tys. zł (2,6%, w tym odpisy dotacji na sfinansowane z nich aktywa), sprzedaż prac i usług badawczo-rozwojowych 7 229,3 tys. zł (1,9%), projekty NCBR i NCN 2 457,0 tys. zł (0,7%) oraz pozostałe pozycje (programy ministra 1 081,4 tys. zł, samorządy 147,7 tys. zł, towary i koszt wytworzenia świadczeń na własne potrzeby 60,0 tys. zł). Przychody mają więc charakter krajowy i w trzech czwartych pochodzą z subwencji, a nie z konkurencyjnej sprzedaży, co tłumaczy ich stabilność.</w:t>
       </w:r>
     </w:p>
     <w:p>
@@ -2477,20 +2461,18 @@
         <w:rPr>
           <w:b w:val="0"/>
         </w:rPr>
-        <w:t xml:space="preserve">Struktura i rynki. Przychody PRz pochodzą głównie z subwencji i dotacji budżetowych, opłat za kształcenie oraz projektów badawczych finansowanych ze środków krajowych i unijnych. </w:t>
+        <w:t>Ciągłość z danymi historycznymi. Plan na 2026 r. (378 280 tys. zł) obejmuje także pozycje, które w sprawozdaniu za 2025 r. leżą poniżej zysku ze sprzedaży: pozostałe przychody operacyjne (11 555 tys. zł) i przychody finansowe (7 855 tys. zł). Porównywalna wartość z 2025 r. to 362 162 tys. zł (przychody netto ze sprzedaży 342 752 + 11 555 + 7 855), więc plan jest o 4,4% wyższy. Jeśli z danych 2025 r. wyłączyć ujemną zmianę stanu produktów (minus 16 520 tys. zł, zob. komentarz do arkusza Sprawozdania finansowe), której plan na 2026 r. nie zakłada (wartość 0,0), porównywalna wartość wynosi 378 682 tys. zł, a plan na 2026 r. jest od niej niższy o 0,1%. Prognoza nie zakłada więc istotnego wzrostu ani spadku przychodów względem faktycznej skali działalności z 2025 r., a tempo 4% rocznie w latach 2027-2029 jest zgodne z Instrukcją. Z tego powodu wskaźniki rentowności sprzedaży w prognozie nie są bezpośrednio porównywalne z 2025 r., bo przychody ze sprzedaży w prognozie zawierają pozycje, które w 2025 r. wykazano osobno.</w:t>
       </w:r>
-      <w:r>
-        <w:rPr>
-          <w:b w:val="0"/>
-          <w:highlight w:val="yellow"/>
-        </w:rPr>
-        <w:t>PRz podaje strukturę przychodów 2025 r.: subwencja i dotacje w %, opłaty za kształcenie w %, projekty badawcze w %, przychody finansowe i pozostałe w %, oraz udział przychodów z zagranicy w %</w:t>
-      </w:r>
+    </w:p>
+    <w:p>
+      <w:pPr>
+        <w:spacing w:after="60"/>
+      </w:pPr>
       <w:r>
         <w:rPr>
           <w:b w:val="0"/>
         </w:rPr>
-        <w:t xml:space="preserve"> Dla finansowania projektu z bieżącej działalności Instrukcja wymaga szczegółowej metodyki prognozy przychodów, danych ilościowych i jakościowych w podziale na rynek krajowy i zagraniczny oraz uzasadnienia znaczącego wzrostu przychodów. Metodykę podano powyżej, a znaczącego wzrostu przychodów nie zakładamy (plan 2026 r. odpowiada poziomowi 2025 r., a dalej obowiązuje stały wzrost 4% rocznie). Z bieżącej działalności PRz finansuje wyłącznie kwotę 33 971 zł (VAT od aparatury), czyli 0,009% planowanych przychodów 2026 r.</w:t>
+        <w:t>Dla finansowania projektu z bieżącej działalności Instrukcja wymaga szczegółowej metodyki prognozy przychodów, danych ilościowych i jakościowych oraz uzasadnienia znaczącego wzrostu przychodów. Metodykę i dane podano powyżej, a znaczącego wzrostu nie zakładamy. Z bieżącej działalności PRz finansuje wyłącznie kwotę 33 971 zł (VAT od aparatury), czyli 0,009% planowanych przychodów 2026 r.</w:t>
       </w:r>
     </w:p>
     <w:p>
@@ -2529,7 +2511,7 @@
           <w:color w:val="666666"/>
           <w:sz w:val="17"/>
         </w:rPr>
-        <w:t xml:space="preserve"> [5892 znaków]</w:t>
+        <w:t xml:space="preserve"> [6692 znaków]</w:t>
       </w:r>
     </w:p>
     <w:p>
@@ -2540,20 +2522,7 @@
         <w:rPr>
           <w:b w:val="0"/>
         </w:rPr>
-        <w:t xml:space="preserve">Koszty dotychczasowej działalności PRz wprowadzono zbiorczo w jednej pozycji (Pozostałe koszty rodzajowe), co Instrukcja dopuszcza dla organizacji badawczych z prawną możliwością odzyskania VAT. Podstawą jest plan finansowo-rzeczowy PRz na 2026 r.: koszty 376 371 tys. zł </w:t>
-      </w:r>
-      <w:r>
-        <w:rPr>
-          <w:b w:val="0"/>
-          <w:highlight w:val="yellow"/>
-        </w:rPr>
-        <w:t>PRz potwierdza, że kwota obejmuje amortyzację (w 2025 r. 22 670 tys. zł), pozostałe koszty operacyjne i koszty finansowe</w:t>
-      </w:r>
-      <w:r>
-        <w:rPr>
-          <w:b w:val="0"/>
-        </w:rPr>
-        <w:t>. W kolejnych latach koszty rosną o 4% rocznie, czyli o stopę dyskonta modelu, tak samo jak przychody (zob. komentarz do arkusza Przychody): 391 426 tys. zł w 2027 r., 407 083 tys. zł w 2028 r. i 423 366 tys. zł w 2029 r. Ponieważ w jednej pozycji ujęto także amortyzację, w prognozie nie jest ona wykazana osobno (wiersz amortyzacji jest zerowy), a skutki tego uproszczenia opisano w komentarzu do arkusza Środki trwałe.</w:t>
+        <w:t>Koszty dotychczasowej działalności PRz wprowadzono zbiorczo w jednej pozycji (Pozostałe koszty rodzajowe), co Instrukcja dopuszcza dla organizacji badawczych z prawną możliwością odzyskania VAT. Podstawą jest plan rzeczowo-finansowy PRz na 2026 r. (zarządzenie Rektora nr 20/2026 z 21.04.2026 r.): koszty działalności operacyjnej 376 370,5 tys. zł, w tym wynagrodzenia 225 552,5 tys. zł (59,9%), ubezpieczenia społeczne i inne świadczenia 60 188,0 tys. zł (16,0%), zużycie materiałów i energii 27 900,0 tys. zł (7,4%), amortyzacja 26 546,6 tys. zł (7,1%), usługi obce 18 000,0 tys. zł (4,8%), pozostałe koszty rodzajowe 15 693,4 tys. zł (4,2%), podatki i opłaty 1 780,0 tys. zł (0,5%) oraz pozostałe koszty operacyjne i wartość sprzedanych towarów 710,0 tys. zł (0,2%). Plan nie zakłada zmiany stanu produktów (wartość 0,0). Koszty finansowe (160,0 tys. zł) i podatek dochodowy (25,0 tys. zł) z planu nie są ujęte w modelu, więc zysk netto w modelu (1 909 tys. zł) jest o 185 tys. zł wyższy od planu (1 724,9 tys. zł), czyli o 0,05% przychodów, co nie ma wpływu na ocenę. W kolejnych latach koszty rosną o 4% rocznie, czyli o stopę dyskonta modelu, tak samo jak przychody (zob. komentarz do arkusza Przychody): 391 426 tys. zł w 2027 r., 407 083 tys. zł w 2028 r. i 423 366 tys. zł w 2029 r. Ponieważ w jednej pozycji ujęto także amortyzację (26 546,6 tys. zł w planie 2026 r., 22 670 tys. zł w 2025 r.), w prognozie nie jest ona wykazana osobno (wiersz amortyzacji jest zerowy), a skutki tego uproszczenia opisano w komentarzu do arkusza Środki trwałe.</w:t>
       </w:r>
     </w:p>
     <w:p>
@@ -2564,7 +2533,7 @@
         <w:rPr>
           <w:b w:val="0"/>
         </w:rPr>
-        <w:t>Ciągłość z danymi historycznymi. Koszty działalności operacyjnej w 2025 r. wyniosły 346 223 tys. zł, więc plan na 2026 r. jest od nich wyższy o 8,7%. Różnicę wyjaśnia przede wszystkim ujemna zmiana stanu produktów w 2025 r. (minus 16 520 tys. zł), która w wariancie porównawczym obniżyła przychody, a nie podniosła kosztów rodzajowych (zob. komentarz do arkusza Sprawozdania finansowe). Po jej uwzględnieniu koszty 2025 r. wynoszą 362 743 tys. zł, a plan 2026 r. jest od nich wyższy o 3,8%, czyli o wartość zbliżoną do tempa wzrostu 4%. Plan jest ostrożny: koszty rosną szybciej niż przychody, więc zakładany wynik netto (1 909 tys. zł w 2026 r., 0,5% przychodów) jest znacznie niższy niż w 2025 r. (15 154 tys. zł), na który złożyły się odsetki (7 315 tys. zł) i dotacje (10 134 tys. zł).</w:t>
+        <w:t>Ciągłość z danymi historycznymi. Koszty działalności operacyjnej w 2025 r. wyniosły 346 223 tys. zł, więc plan na 2026 r. jest od nich wyższy o 8,7%. Różnicę wyjaśnia przede wszystkim ujemna zmiana stanu produktów w 2025 r. (minus 16 520 tys. zł), która w wariancie porównawczym obniżyła przychody, a nie podniosła kosztów rodzajowych (zob. komentarz do arkusza Sprawozdania finansowe). Po jej uwzględnieniu koszty 2025 r. wynoszą 362 743 tys. zł, a plan 2026 r. jest od nich wyższy o 3,8%, czyli o wartość zbliżoną do tempa wzrostu 4%. Największe zmiany pozycji w planie względem 2025 r. to usługi obce (18 000 wobec 13 101 tys. zł), amortyzacja (26 547 wobec 22 670 tys. zł) i pozostałe koszty rodzajowe (15 693 wobec 12 534 tys. zł); wynagrodzenia rosną o 4,9%, a materiały i energia oraz świadczenia o 8,7%. Plan jest ostrożny: koszty rosną szybciej niż przychody, więc zakładany wynik netto (1 909 tys. zł w 2026 r., 0,5% przychodów) jest znacznie niższy niż w 2025 r. (15 154 tys. zł), na który złożyły się odsetki (7 315 tys. zł) i dotacje (10 134 tys. zł).</w:t>
       </w:r>
     </w:p>
     <w:p>
@@ -2621,14 +2590,7 @@
         <w:rPr>
           <w:b w:val="0"/>
         </w:rPr>
-        <w:t xml:space="preserve">3) Koszty pośrednie rozliczane ryczałtem 25% kosztów bezpośrednich (wynagrodzenia i amortyzacja): 206 793,18 zł, z czego 133 544,50 zł przypada na badania przemysłowe (25% z 386 478,00 + 147 700,00 zł) i 73 248,68 zł na prace rozwojowe (25% z 292 994,72 zł). W latach realizacji wynoszą 6, 106, 77 i 18 tys. zł (łącznie 207 tys. zł po zaokrągleniu), proporcjonalnie do kosztów bezpośrednich. Ujęto je w pozycji Usługi obce (Projekt) i oznaczono jako koszt kwalifikowalny z dofinansowaniem 100%. </w:t>
-      </w:r>
-      <w:r>
-        <w:rPr>
-          <w:b w:val="0"/>
-          <w:highlight w:val="yellow"/>
-        </w:rPr>
-        <w:t>Wariant, jeśli koszty pośrednie zostaną przeniesione do Pozostałych kosztów rodzajowych zgodnie z uwagą 4 do arkusza w Instrukcji: Ujęto je w pozycji Pozostałe koszty rodzajowe (Projekt), zgodnie z Instrukcją, i oznaczono jako koszt kwalifikowalny z dofinansowaniem 100%.</w:t>
+        <w:t>3) Koszty pośrednie rozliczane ryczałtem 25% kosztów bezpośrednich (wynagrodzenia i amortyzacja): 206 793,18 zł, z czego 133 544,50 zł przypada na badania przemysłowe (25% z 386 478,00 + 147 700,00 zł) i 73 248,68 zł na prace rozwojowe (25% z 292 994,72 zł). W latach realizacji wynoszą 6, 106, 77 i 18 tys. zł (łącznie 207 tys. zł po zaokrągleniu), proporcjonalnie do kosztów bezpośrednich. Zgodnie z uwagą 4 do arkusza w Instrukcji ujęto je w pozycji Pozostałe koszty rodzajowe (Projekt) i oznaczono jako koszt kwalifikowalny z dofinansowaniem 100%.</w:t>
       </w:r>
     </w:p>
     <w:p>
@@ -2667,7 +2629,7 @@
           <w:color w:val="666666"/>
           <w:sz w:val="17"/>
         </w:rPr>
-        <w:t xml:space="preserve"> [3223 znaków]</w:t>
+        <w:t xml:space="preserve"> [3734 znaków]</w:t>
       </w:r>
     </w:p>
     <w:p>
@@ -2678,7 +2640,7 @@
         <w:rPr>
           <w:b w:val="0"/>
         </w:rPr>
-        <w:t>Środki trwałe dotychczasowej działalności. Wartość księgowa netto na 31.12.2025 r. (wartości niematerialne 1 066 tys. zł; grunty 8 246 tys. zł; budynki i budowle 245 874 tys. zł; urządzenia techniczne i maszyny 35 729 tys. zł; środki transportu 984 tys. zł; inne środki trwałe 497 tys. zł; środki trwałe w budowie 18 075 tys. zł) pochodzi ze sprawozdania finansowego za 2025 r. W prognozie 2026-2029 wszystkie te wartości utrzymano bez zmian: nie prognozowano odrębnie amortyzacji ani zakupów, ponieważ koszty dotychczasowej działalności (wraz z amortyzacją) wprowadzono zbiorczo w arkuszu Koszty operacyjne. Przyjęto w ten sposób, że nakłady odtworzeniowe PRz równoważą roczną amortyzację (22 670 tys. zł w 2025 r.). Uproszczenie dotyczy tylko wartości pozycji bilansowych i nie zmienia wyniku ani przepływów, bo koszt amortyzacji jest już w kosztach zbiorczych, a nakłady odtworzeniowe i amortyzacja się równoważą. PRz nie rozlicza w projekcie amortyzacji posiadanych środków trwałych, więc tabela „posiadane środki trwałe wykorzystane do realizacji projektu” jest pusta.</w:t>
+        <w:t>Środki trwałe dotychczasowej działalności. Wartość księgowa netto na 31.12.2025 r. (wartości niematerialne 1 066 tys. zł; grunty 8 246 tys. zł; budynki i budowle 245 874 tys. zł; urządzenia techniczne i maszyny 35 729 tys. zł; środki transportu 984 tys. zł; inne środki trwałe 497 tys. zł; środki trwałe w budowie 18 075 tys. zł) pochodzi ze sprawozdania finansowego za 2025 r. W prognozie 2026-2029 wszystkie te wartości utrzymano bez zmian: nie prognozowano odrębnie amortyzacji ani zakupów, ponieważ koszty dotychczasowej działalności (wraz z amortyzacją) wprowadzono zbiorczo w arkuszu Koszty operacyjne. Plan rzeczowo-finansowy na 2026 r. przewiduje amortyzację 26 546,6 tys. zł i nakłady na rzeczowe aktywa trwałe i wartości niematerialne 60 152,2 tys. zł (w tym sfinansowane lub dofinansowane z dotacji celowych 22 092,7 tys. zł), a w 2025 r. amortyzacja wyniosła 22 670 tys. zł, a nabycie aktywów trwałych 30 532 tys. zł. Model nie wyodrębnia ani amortyzacji, ani tych nakładów (koszt amortyzacji jest w kosztach zbiorczych), więc przyjęto uproszczenie, że wartość majątku się nie zmienia. Uproszczenie nie zmienia wyniku, ale pomija różnicę nakładów i amortyzacji (w 2026 r. ok. 33,6 mln zł), więc prognozowane środki pieniężne są wyższe niż po uwzględnieniu planu inwestycyjnego. Skutek dla płynności opisano w komentarzu do arkusza Ocena kondycji finansowej, a dla projektu nie ma on znaczenia (wydatki projektu to 1 033 965,90 zł). PRz nie rozlicza w projekcie amortyzacji posiadanych środków trwałych, więc tabela „posiadane środki trwałe wykorzystane do realizacji projektu” jest pusta.</w:t>
       </w:r>
     </w:p>
     <w:p>
@@ -2700,20 +2662,7 @@
         <w:rPr>
           <w:b w:val="0"/>
         </w:rPr>
-        <w:t xml:space="preserve">Koszty zakończonych prac rozwojowych. Wynagrodzenia z prac rozwojowych (Z4, Z5 i Z8) w kwocie 293 tys. zł (223 tys. zł poniesione w 2028 r. i 70 tys. zł w 2029 r.) model aktywuje w kwietniu 2029 r., w momencie zakończenia prac rozwojowych, jako wartość niematerialną z dofinansowaniem 100%. W bilansie PRz na koniec 2029 r. pojawia się więc 293 tys. zł wartości niematerialnej i równa kwota rozliczeń międzyokresowych biernych z tytułu dotacji. Amortyzacji tej wartości nie ujęto: PRz zgodnie z umową konsorcjum przekaże wyniki prac Liderowi (zob. komentarz do arkusza Finansowanie), a poza 2029 r. model PRz nie ma danych. </w:t>
-      </w:r>
-      <w:r>
-        <w:rPr>
-          <w:b w:val="0"/>
-          <w:highlight w:val="yellow"/>
-        </w:rPr>
-        <w:t>Wariant dla stawki 0% w komórce C195: Stawkę amortyzacji kosztów zakończonych prac rozwojowych ustawiono na 0%, ponieważ PRz nie amortyzuje tych wyników.</w:t>
-      </w:r>
-      <w:r>
-        <w:rPr>
-          <w:b w:val="0"/>
-        </w:rPr>
-        <w:t xml:space="preserve"> Koszty pośrednie (ryczałt) nie są aktywowane i pozostają kosztem okresu.</w:t>
+        <w:t>Koszty zakończonych prac rozwojowych. Wynagrodzenia z prac rozwojowych (Z4, Z5 i Z8) w kwocie 293 tys. zł (223 tys. zł poniesione w 2028 r. i 70 tys. zł w 2029 r.) model aktywuje w kwietniu 2029 r., w momencie zakończenia prac rozwojowych, jako wartość niematerialną z dofinansowaniem 100%. W bilansie PRz na koniec 2029 r. pojawia się więc 293 tys. zł wartości niematerialnej i równa kwota rozliczeń międzyokresowych biernych z tytułu dotacji. Amortyzacji tej wartości nie ujęto: PRz zgodnie z umową konsorcjum przekaże wyniki prac Liderowi (zob. komentarz do arkusza Finansowanie), a poza 2029 r. model PRz nie ma danych. Stawkę amortyzacji kosztów zakończonych prac rozwojowych (komórki C195 i C196) ustawiono na 0%, ponieważ PRz nie amortyzuje tych wyników. Koszty pośrednie (ryczałt) nie są aktywowane i pozostają kosztem okresu.</w:t>
       </w:r>
     </w:p>
     <w:p>
@@ -2741,7 +2690,7 @@
           <w:color w:val="666666"/>
           <w:sz w:val="17"/>
         </w:rPr>
-        <w:t xml:space="preserve"> [2359 znaków]</w:t>
+        <w:t xml:space="preserve"> [2633 znaków]</w:t>
       </w:r>
     </w:p>
     <w:p>
@@ -2752,7 +2701,7 @@
         <w:rPr>
           <w:b w:val="0"/>
         </w:rPr>
-        <w:t>PRz ma prawną możliwość odzyskania podatku VAT, w związku z czym, zgodnie z Instrukcją, nie wypełniono szczegółowych tabel rozterminowania w wierszach 18-22, 28-32 i 38-42. Wartość rozliczeń międzyokresowych biernych z tytułu dotacji w bilansie na 31.12.2025 r. wynosi 54 945 tys. zł (23 947 tys. zł długoterminowe i 30 998 tys. zł krótkoterminowe) i jest wykazana zbiorczo jako kwota pozostająca do rozliczenia (komórka J15). Utrzymano ją na stałym poziomie w całym okresie 2026-2029, przyjmując, że rozliczanie dotacji z lat poprzednich jest równoważone nowymi dotacjami otrzymywanymi przez PRz, a ich skutek w wyniku jest zawarty w zbiorczych przychodach z arkusza Przychody.</w:t>
+        <w:t>PRz ma prawną możliwość odzyskania podatku VAT, w związku z czym, zgodnie z Instrukcją, nie wypełniono szczegółowych tabel rozterminowania w wierszach 18-22, 28-32 i 38-42. Wartość rozliczeń międzyokresowych biernych z tytułu dotacji w bilansie na 31.12.2025 r. wynosi 54 945 tys. zł (23 947 tys. zł długoterminowe i 30 998 tys. zł krótkoterminowe) i jest wykazana zbiorczo jako kwota pozostająca do rozliczenia (komórka J15). Utrzymano ją na stałym poziomie w całym okresie 2026-2029, ponieważ odpisy dotacji (równowartość amortyzacji sfinansowanej z dotacji: 10 134 tys. zł w 2025 r., a według danych PRz 11 100, 7 735 i 5 711 tys. zł w latach 2026-2028) są w prognozie zawarte w zbiorczych przychodach z arkusza Przychody, a PRz otrzymuje kolejne dotacje na inwestycje (plan 2026 r.: nakłady sfinansowane lub dofinansowane z dotacji celowych 22 092,7 tys. zł). Jest to uproszczenie, które nie wpływa na wynik, bo odpisy dotacji są już w przychodach.</w:t>
       </w:r>
     </w:p>
     <w:p>
@@ -2802,7 +2751,7 @@
           <w:color w:val="666666"/>
           <w:sz w:val="17"/>
         </w:rPr>
-        <w:t xml:space="preserve"> [2504 znaków]</w:t>
+        <w:t xml:space="preserve"> [2603 znaków]</w:t>
       </w:r>
     </w:p>
     <w:p>
@@ -2813,20 +2762,7 @@
         <w:rPr>
           <w:b w:val="0"/>
         </w:rPr>
-        <w:t xml:space="preserve">Dotychczasowa działalność. Rotację zapasów, należności i zobowiązań obliczył model w opcji „kalkulacja z modelu” na podstawie danych bilansowych i wyniku za 2025 r. (zapasy 5 759 tys. zł, należności z tytułu dostaw i usług 2 959 tys. zł, zobowiązania z tytułu dostaw i usług 7 871 tys. zł). Wynik to 6 dni rotacji zapasów, 3 dni rotacji należności i 8 dni rotacji zobowiązań, utrzymane bez zmian w latach 2026-2029. Kalkulacji własnej nie zastosowano, więc nie wymaga ona uzasadnienia. Niski poziom rotacji należności z tytułu dostaw i usług wynika ze struktury przychodów uczelni: większość pochodzi z subwencji i dotacji, a nie z faktur wystawianych odbiorcom z odroczonym terminem płatności </w:t>
-      </w:r>
-      <w:r>
-        <w:rPr>
-          <w:b w:val="0"/>
-          <w:highlight w:val="yellow"/>
-        </w:rPr>
-        <w:t>PRz potwierdza strukturę rozliczeń</w:t>
-      </w:r>
-      <w:r>
-        <w:rPr>
-          <w:b w:val="0"/>
-        </w:rPr>
-        <w:t>. Kapitał pracujący dotychczasowej działalności (zapasy plus należności minus zobowiązania z tytułu dostaw i usług) wynosi 7 928 tys. zł w 2025 r. i 1 047, 1 089, 1 129 oraz 1 177 tys. zł w latach 2026-2029.</w:t>
+        <w:t>Dotychczasowa działalność. Rotację zapasów, należności i zobowiązań obliczył model w opcji „kalkulacja z modelu” na podstawie danych bilansowych i wyniku za 2025 r. (zapasy 5 759 tys. zł, należności z tytułu dostaw i usług 2 959 tys. zł, zobowiązania z tytułu dostaw i usług 7 871 tys. zł). Wynik to 6 dni rotacji zapasów, 3 dni rotacji należności i 8 dni rotacji zobowiązań, utrzymane bez zmian w latach 2026-2029. Kalkulacji własnej nie zastosowano, więc nie wymaga ona uzasadnienia. Niski poziom rotacji należności z tytułu dostaw i usług (2 959 tys. zł, czyli 0,9% przychodów) wynika ze struktury przychodów uczelni: ok. 76% planowanych przychodów to subwencja, a dalsze 6% to opłaty za kształcenie, a nie faktury wystawiane odbiorcom z odroczonym terminem płatności (struktura przychodów w komentarzu do arkusza Przychody). Kapitał pracujący dotychczasowej działalności (zapasy plus należności minus zobowiązania z tytułu dostaw i usług) wynosi 7 928 tys. zł w 2025 r. i 1 047, 1 089, 1 129 oraz 1 177 tys. zł w latach 2026-2029.</w:t>
       </w:r>
     </w:p>
     <w:p>
@@ -2876,7 +2812,7 @@
           <w:color w:val="666666"/>
           <w:sz w:val="17"/>
         </w:rPr>
-        <w:t xml:space="preserve"> [4252 znaków]</w:t>
+        <w:t xml:space="preserve"> [4314 znaków]</w:t>
       </w:r>
     </w:p>
     <w:p>
@@ -2887,7 +2823,7 @@
         <w:rPr>
           <w:b w:val="0"/>
         </w:rPr>
-        <w:t>Struktura finansowania dotychczasowej działalności nie zmienia się w okresie prognozy: nie ma planowanych dopłat do kapitału (kapitał podstawowy 339 418 tys. zł jest stały), wypłat z zysku ani dywidendy, nowych kredytów, pożyczek, leasingu finansowego, depozytów bankowych ani wpływów z oprocentowania. PRz nie ma kredytów ani pożyczek, a nadwyżki finansowe zwiększają kapitał własny (zysk netto 1 909, 1 985, 2 065 i 2 148 tys. zł w latach 2026-2029). Środki pieniężne wynoszą 157 378 tys. zł na 31.12.2025 r. i 166 168, 168 111, 170 136 oraz 172 236 tys. zł na koniec lat 2026-2029.</w:t>
+        <w:t>Struktura finansowania dotychczasowej działalności nie zmienia się w okresie prognozy: nie ma planowanych dopłat do kapitału (kapitał podstawowy 339 418 tys. zł jest stały), wypłat z zysku ani dywidendy, nowych kredytów, pożyczek, leasingu finansowego, depozytów bankowych ani wpływów z oprocentowania. PRz nie ma kredytów ani pożyczek, a nadwyżki finansowe zwiększają kapitał własny (zysk netto 1 909, 1 985, 2 065 i 2 148 tys. zł w latach 2026-2029). Środki pieniężne wynoszą 157 378 tys. zł na 31.12.2025 r. (z czego 3 071 tys. zł ma ograniczoną możliwość dysponowania) i 166 168, 168 111, 170 136 oraz 172 236 tys. zł na koniec lat 2026-2029.</w:t>
       </w:r>
     </w:p>
     <w:p>
@@ -3044,7 +2980,7 @@
           <w:color w:val="666666"/>
           <w:sz w:val="17"/>
         </w:rPr>
-        <w:t xml:space="preserve"> [4779 znaków]</w:t>
+        <w:t xml:space="preserve"> [5922 znaków]</w:t>
       </w:r>
     </w:p>
     <w:p>
@@ -3066,7 +3002,7 @@
         <w:rPr>
           <w:b w:val="0"/>
         </w:rPr>
-        <w:t>Strata na sprzedaży w 2025 r. i wskaźniki rentowności. W 2025 r. strata na sprzedaży wyniosła 3 471 tys. zł, co daje rentowność sprzedaży (ROS) minus 1,0%. Przyczyną jest zmiana stanu produktów (minus 16 520 tys. zł), a nie słaba sprzedaż: bez niej wynik na sprzedaży byłby dodatni (13 049 tys. zł). Pozostałe przychody operacyjne i finansowe sprawiają, że zysk operacyjny (7 530 tys. zł), zysk brutto (15 176 tys. zł) i zysk netto (15 154 tys. zł) są dodatnie, a rentowność netto wynosi 4,4%, a rentowność aktywów (ROA) 2,9%. Pełne wyjaśnienie podano w komentarzu do arkusza Sprawozdania finansowe. W latach 2026-2029 wskaźniki ROS i rentowności netto wynoszą 0,5%, a ROA 0,4%, ponieważ plan finansowo-rzeczowy zakłada wynik bliski zeru (zysk netto 1 909-2 148 tys. zł), a koszty rosną tak samo jak przychody (4% rocznie). Wskaźniki te są niższe od norm z Instrukcji (ROS co najmniej 1,5%, ROA co najmniej 10%), ale dodatnie. Niska rentowność aktywów jest naturalna dla uczelni publicznej, której majątek trwały (350 933 tys. zł) stanowi dwie trzecie aktywów, a celem nie jest maksymalizacja zysku. Prognozowane wskaźniki nie są porównywalne wprost z 2025 r., bo przychody ze sprzedaży w prognozie zawierają pozycje, które w 2025 r. były wykazane osobno (zob. komentarz do arkusza Przychody).</w:t>
+        <w:t>Strata na sprzedaży w 2025 r. i wskaźniki rentowności. W 2025 r. strata na sprzedaży wyniosła 3 470 tys. zł, co daje rentowność sprzedaży (ROS) minus 1,0%. Przyczyną jest zmiana stanu produktów (minus 16 520 tys. zł, pozycja stała, w 2024 r. minus 11 912 tys. zł), a nie słaba sprzedaż: bez niej wynik na sprzedaży byłby dodatni (13 049 tys. zł). Pozostałe przychody operacyjne i finansowe sprawiają, że zysk operacyjny (7 530 tys. zł), zysk brutto (15 176 tys. zł) i zysk netto (15 154 tys. zł) są dodatnie, a rentowność netto wynosi 4,4%, a rentowność aktywów (ROA) 2,9%. Pełne wyjaśnienie podano w komentarzu do arkusza Sprawozdania finansowe. W latach 2026-2029 wskaźniki ROS i rentowności netto wynoszą 0,5%, a ROA 0,4%, ponieważ plan rzeczowo-finansowy zakłada wynik bliski zeru, a koszty rosną tak samo jak przychody (4% rocznie). Plan na 2026 r. zakłada ujemny wynik z działalności operacyjnej (minus 4 590,1 tys. zł) i dodatni wynik netto (1 724,9 tys. zł) dzięki przychodom finansowym (6 500 tys. zł, w tym odsetki 6 400 tys. zł). W modelu przychody finansowe są w zbiorczej pozycji przychodów, więc model pokazuje zysk ze sprzedaży 1 909 tys. zł (ROS 0,5%) i pomija koszty finansowe (160 tys. zł) oraz podatek (25 tys. zł), a prognozowane wskaźniki nie są porównywalne wprost z 2025 r. (zob. komentarz do arkusza Przychody). Wskaźniki są niższe od norm z Instrukcji (ROS co najmniej 1,5%, ROA co najmniej 10%), ale dodatnie. Niska rentowność aktywów jest naturalna dla uczelni publicznej, której majątek trwały (350 933 tys. zł) stanowi dwie trzecie aktywów, a celem nie jest maksymalizacja zysku.</w:t>
       </w:r>
     </w:p>
     <w:p>
@@ -3077,7 +3013,18 @@
         <w:rPr>
           <w:b w:val="0"/>
         </w:rPr>
-        <w:t>Pozostałe wskaźniki. Udział kapitałów własnych wynosi 67,5% w 2025 r. i 67,6-67,8% w latach 2026-2029 (norma co najmniej 50%), wskaźnik zadłużenia 32,5% i 32,2-32,4% (poniżej przedziału 50-70%, co oznacza niskie zadłużenie), a pokrycie majątku trwałego kapitałem stałym 133,4% i 133,9-135,7% (norma co najmniej 100%). Płynność bieżąca wynosi 3,05 w 2025 r. i 3,07-3,14 w latach 2026-2029, a płynność szybka 2,95 i 2,96-3,02, czyli powyżej przedziałów z Instrukcji (1,2-1,5 i 1,0-1,2). Wynika to z dużych środków pieniężnych (157 378 tys. zł), z których część ma określone przeznaczenie (fundusze specjalne 19 873 tys. zł i rozliczenia międzyokresowe z dotacji 54 945 tys. zł), więc nie jest ryzykiem finansowym. Księgowy stosunek kapitału obcego do własnego wynosi 0,5 (norma nie więcej niż 1,0). Wskaźniki obsługi długu (37 847) i pokrycia odsetek EBITDA (30 200) w 2025 r. są bardzo wysokie, ponieważ koszty odsetek wyniosły tylko 1 tys. zł, a w prognozie są niedostępne (bd.), bo PRz nie ma zadłużenia ani odsetek.</w:t>
+        <w:t>Pozostałe wskaźniki. Udział kapitałów własnych wynosi 67,5% w 2025 r. i 67,6-67,8% w latach 2026-2029 (norma co najmniej 50%), wskaźnik zadłużenia 32,5% i 32,2-32,4% (poniżej przedziału 50-70%, co oznacza niskie zadłużenie), a pokrycie majątku trwałego kapitałem stałym 133,4% i 133,9-135,7% (norma co najmniej 100%). Płynność bieżąca wynosi 3,05 w 2025 r. i 3,07-3,14 w latach 2026-2029, a płynność szybka 2,95 i 2,96-3,02, czyli powyżej przedziałów z Instrukcji (1,2-1,5 i 1,0-1,2). Wynika to z dużych środków pieniężnych (157 378 tys. zł), z których część ma określone przeznaczenie (ograniczona możliwość dysponowania 3 071 tys. zł, fundusze specjalne 19 873 tys. zł i rozliczenia międzyokresowe z dotacji 54 945 tys. zł), więc nie jest ryzykiem finansowym. Księgowy stosunek kapitału obcego do własnego wynosi 0,5 (norma nie więcej niż 1,0). Wskaźniki obsługi długu (37 847) i pokrycia odsetek EBITDA (30 200) w 2025 r. są bardzo wysokie, ponieważ koszty odsetek wyniosły tylko 1 tys. zł, a w prognozie są niedostępne (bd.), bo PRz nie ma zadłużenia ani odsetek.</w:t>
+      </w:r>
+    </w:p>
+    <w:p>
+      <w:pPr>
+        <w:spacing w:after="60"/>
+      </w:pPr>
+      <w:r>
+        <w:rPr>
+          <w:b w:val="0"/>
+        </w:rPr>
+        <w:t>Ograniczenia prognozy. Model nie wyodrębnia amortyzacji (26 546,6 tys. zł w planie 2026 r.) ani nakładów inwestycyjnych (60 152,2 tys. zł w planie 2026 r.), więc pomija różnicę ok. 33,6 mln zł rocznie, o którą nakłady przewyższają amortyzację, i prognozowane środki pieniężne są od tej kwoty wyższe. Po jej uwzględnieniu płynność bieżąca w 2026 r. wynosiłaby ok. 2,5 (środki obrotowe ok. 143 mln zł wobec zobowiązań krótkoterminowych 57,5 mln zł), czyli nadal ponad przedziałem 1,2-1,5, a PRz nie ma kredytów. W prognozowanym rachunku przepływów 2026 r. zmiana stanu należności jest dodatnia (6 931 tys. zł), bo model prognozuje tylko należności z tytułu dostaw i usług (zob. komentarz do arkusza Kapitał pracujący); nie oznacza to spodziewanego wpływu gotówki. Rachunek przepływów za 2025 r. w arkuszu jest wyliczony przez model wobec zerowego bilansu otwarcia, więc pokazuje całość sald bilansowych jako przepływy roku (m.in. dopłaty do kapitału 339 418 tys. zł). Rzeczywiste przepływy 2025 r. wynoszą: operacyjne plus 45 194 tys. zł, inwestycyjne minus 28 418 tys. zł, finansowe plus 15 171 tys. zł, a środki pieniężne wzrosły ze 125 431 do 157 378 tys. zł (zob. komentarz do arkusza Sprawozdania finansowe).</w:t>
       </w:r>
     </w:p>
     <w:p>
@@ -3089,18 +3036,6 @@
           <w:b w:val="0"/>
         </w:rPr>
         <w:t>Projekt. W części dotyczącej Projektu przychodów nie ma, a koszty operacyjne (30, 531, 163 i 18 tys. zł) powodują stratę na sprzedaży Projektu w tych samych kwotach. Strata ta jest w całości pokryta pozostałymi przychodami operacyjnymi, czyli dotacją (30, 531, 163 i 18 tys. zł), więc wynik operacyjny i netto Projektu w każdym roku wynosi zero i nie powstaje strata brutto. W 2028 r. koszty prac rozwojowych (223 tys. zł) nie obciążają rachunku zysków i strat, tylko są aktywowane w kwietniu 2029 r. razem z kosztami prac rozwojowych 2029 r. (łącznie 293 tys. zł), a po stronie pasywów odpowiada im rozliczenie międzyokresowe bierne z tytułu dotacji. Wydatek na aparaturę (148 tys. zł w 2027 r.) jest kosztem 2027 r., w całości pokrytym dotacją. Wpływ Projektu na wskaźniki PRz jest niewielki: wskaźniki działalności z Projektem są takie same jak dla działalności dotychczasowej (udział kapitałów własnych, płynność, ROA) albo różnią się o mniej niż 0,2 punktu procentowego (ROS 0,37% w 2027 r. i 0,46% w 2028 r. wobec 0,50%, bo strata na sprzedaży Projektu obniża zysk ze sprzedaży).</w:t>
-      </w:r>
-    </w:p>
-    <w:p>
-      <w:pPr>
-        <w:spacing w:after="60"/>
-      </w:pPr>
-      <w:r>
-        <w:rPr>
-          <w:b w:val="0"/>
-          <w:highlight w:val="yellow"/>
-        </w:rPr>
-        <w:t>Wariant do wklejenia tylko, jeśli w modelu pozostaje brak danych za 2023 i 2024 r.: Rachunek przepływów pieniężnych za 2025 r. jest wyliczony przez model wobec zerowego bilansu otwarcia, ponieważ w modelu nie ma danych za 2024 r., i dlatego wykazuje całość sald bilansowych na koniec 2025 r. jako przepływy tego roku (m.in. dopłaty do kapitału 339 418 tys. zł). Nie odzwierciedla to rzeczywistych przepływów pieniężnych PRz w 2025 r.</w:t>
       </w:r>
     </w:p>
     <w:p>
@@ -3127,18 +3062,7 @@
         <w:pStyle w:val="Heading1"/>
       </w:pPr>
       <w:r>
-        <w:t>6. Decyzje do podjęcia i dane do uzupełnienia</w:t>
-      </w:r>
-    </w:p>
-    <w:p>
-      <w:pPr>
-        <w:spacing w:after="60"/>
-      </w:pPr>
-      <w:r>
-        <w:rPr>
-          <w:b w:val="0"/>
-        </w:rPr>
-        <w:t>Komentarze nie wymagają zmian w liczbach modelu, ale cztery sprawy dotyczą samego modelu i wymagają Twojej decyzji (wprowadzę je wtedy w modelu PRz, tak jak poprzednio, po kolei i z weryfikacją).</w:t>
+        <w:t>6. Zrealizowane decyzje i co zostało otwarte</w:t>
       </w:r>
     </w:p>
     <w:tbl>
@@ -3170,7 +3094,7 @@
         </w:tc>
         <w:tc>
           <w:tcPr>
-            <w:tcW w:type="dxa" w:w="5329"/>
+            <w:tcW w:type="dxa" w:w="2948"/>
           </w:tcPr>
           <w:p>
             <w:r/>
@@ -3185,7 +3109,7 @@
         </w:tc>
         <w:tc>
           <w:tcPr>
-            <w:tcW w:type="dxa" w:w="3969"/>
+            <w:tcW w:type="dxa" w:w="6350"/>
           </w:tcPr>
           <w:p>
             <w:r/>
@@ -3194,7 +3118,7 @@
                 <w:b/>
                 <w:sz w:val="18"/>
               </w:rPr>
-              <w:t>Rekomendacja</w:t>
+              <w:t>Rozstrzygnięcie</w:t>
             </w:r>
           </w:p>
         </w:tc>
@@ -3217,29 +3141,7 @@
         </w:tc>
         <w:tc>
           <w:tcPr>
-            <w:tcW w:type="dxa" w:w="5329"/>
-          </w:tcPr>
-          <w:p>
-            <w:r/>
-            <w:r>
-              <w:rPr>
-                <w:b/>
-                <w:sz w:val="18"/>
-              </w:rPr>
-              <w:t>Brak danych za 2023 i 2024 r. w arkuszu Sprawozdania finansowe.</w:t>
-            </w:r>
-            <w:r>
-              <w:rPr>
-                <w:b w:val="0"/>
-                <w:sz w:val="18"/>
-              </w:rPr>
-              <w:t xml:space="preserve"> Instrukcja (pkt 5b) wymaga trzech lat historycznych także od organizacji badawczych z odzyskiwanym VAT, a model ma tylko 2025 r. Skutek uboczny: rachunek przepływów za 2025 r. liczy się wobec zerowego bilansu otwarcia i pokazuje m.in. dopłaty do kapitału 339 418 tys. zł. Ekspert może to zauważyć.</w:t>
-            </w:r>
-          </w:p>
-        </w:tc>
-        <w:tc>
-          <w:tcPr>
-            <w:tcW w:type="dxa" w:w="3969"/>
+            <w:tcW w:type="dxa" w:w="2948"/>
           </w:tcPr>
           <w:p>
             <w:r/>
@@ -3248,7 +3150,22 @@
                 <w:b w:val="0"/>
                 <w:sz w:val="18"/>
               </w:rPr>
-              <w:t>Poprosić PRz o bilans i RZiS za 2023 i 2024 r. (sprawozdania uczelni są jawne) i wprowadzić. Wtedy w komentarzach zostają żółte „warianty do wklejenia” dla Sprawozdań, a z Oceny kondycji usuwamy zdanie o przepływach 2025 r. Jeśli danych nie będzie, wklejamy wariant z Oceny kondycji i nie wklejamy wariantu ze Sprawozdań.</w:t>
+              <w:t>Dane PRz za 2023 i 2024 r. w arkuszu Sprawozdania finansowe</w:t>
+            </w:r>
+          </w:p>
+        </w:tc>
+        <w:tc>
+          <w:tcPr>
+            <w:tcW w:type="dxa" w:w="6350"/>
+          </w:tcPr>
+          <w:p>
+            <w:r/>
+            <w:r>
+              <w:rPr>
+                <w:b w:val="0"/>
+                <w:sz w:val="18"/>
+              </w:rPr>
+              <w:t>Decyzja właścicielki: nie wprowadzamy (uproszczona sprawozdawczość organizacji badawczej). Komentarze podają dane porównawcze za 2024 r. z tego samego sprawozdania, a wariantów „do wklejenia po uzupełnieniu danych” już nie ma. Pozostaje drobne ryzyko, bo pkt 5b Instrukcji wprost wymienia trzy lata historyczne dla organizacji z odzyskiwanym VAT. Rachunek przepływów 2025 r. w arkuszu liczy się wobec zerowego bilansu otwarcia (dopłaty do kapitału 339 418 tys. zł); wyjaśnia to komentarz Oceny kondycji, który podaje przy tym rzeczywiste przepływy ze sprawozdania.</w:t>
             </w:r>
           </w:p>
         </w:tc>
@@ -3271,29 +3188,7 @@
         </w:tc>
         <w:tc>
           <w:tcPr>
-            <w:tcW w:type="dxa" w:w="5329"/>
-          </w:tcPr>
-          <w:p>
-            <w:r/>
-            <w:r>
-              <w:rPr>
-                <w:b/>
-                <w:sz w:val="18"/>
-              </w:rPr>
-              <w:t>Koszty pośrednie (ryczałt 25%, 206 793,18 zł) są w pozycji „Usługi obce (Projekt)”.</w:t>
-            </w:r>
-            <w:r>
-              <w:rPr>
-                <w:b w:val="0"/>
-                <w:sz w:val="18"/>
-              </w:rPr>
-              <w:t xml:space="preserve"> Instrukcja (Koszty operacyjne, uwaga 4) każe ujmować je w Pozostałych kosztach rodzajowych. Zmienia się tylko kategoria kosztu, nie kwoty ani dofinansowanie.</w:t>
-            </w:r>
-          </w:p>
-        </w:tc>
-        <w:tc>
-          <w:tcPr>
-            <w:tcW w:type="dxa" w:w="3969"/>
+            <w:tcW w:type="dxa" w:w="2948"/>
           </w:tcPr>
           <w:p>
             <w:r/>
@@ -3302,7 +3197,22 @@
                 <w:b w:val="0"/>
                 <w:sz w:val="18"/>
               </w:rPr>
-              <w:t>Przenieść do Pozostałych kosztów rodzajowych (Projekt). Wtedy w komentarzu Koszty operacyjne wklejamy wariant w żółtym nawiasie.</w:t>
+              <w:t>Koszty pośrednie (206 793,18 zł)</w:t>
+            </w:r>
+          </w:p>
+        </w:tc>
+        <w:tc>
+          <w:tcPr>
+            <w:tcW w:type="dxa" w:w="6350"/>
+          </w:tcPr>
+          <w:p>
+            <w:r/>
+            <w:r>
+              <w:rPr>
+                <w:b w:val="0"/>
+                <w:sz w:val="18"/>
+              </w:rPr>
+              <w:t>Wykonane w modelu: przeniesione z „Usługi obce (Projekt)” do „Pozostałe koszty rodzajowe (Projekt)”. Kwoty, dofinansowanie i wszystkie sumy bez zmian (sprawdzone po przeliczeniu; zmieniły się tylko podziały na kategorie w Opłacalności i Ocenie kondycji).</w:t>
             </w:r>
           </w:p>
         </w:tc>
@@ -3325,29 +3235,7 @@
         </w:tc>
         <w:tc>
           <w:tcPr>
-            <w:tcW w:type="dxa" w:w="5329"/>
-          </w:tcPr>
-          <w:p>
-            <w:r/>
-            <w:r>
-              <w:rPr>
-                <w:b/>
-                <w:sz w:val="18"/>
-              </w:rPr>
-              <w:t>Stawka amortyzacji kosztów zakończonych prac rozwojowych (Środki trwałe, komórki C195 i C196) jest pusta</w:t>
-            </w:r>
-            <w:r>
-              <w:rPr>
-                <w:b w:val="0"/>
-                <w:sz w:val="18"/>
-              </w:rPr>
-              <w:t>, więc kolumna „kontrolka” pokazuje „uzupełnij dane”. Sprawdziłam wpływ: wpisanie 20% (jak u Lidera) dodałoby 39 tys. zł amortyzacji w 2029 r. i zmieniłoby wyniki. Wpisanie 0% usuwa komunikat i nie zmienia żadnej liczby w arkuszach wynikowych (zmieniają się tylko komórki pomocnicze poza wynikami).</w:t>
-            </w:r>
-          </w:p>
-        </w:tc>
-        <w:tc>
-          <w:tcPr>
-            <w:tcW w:type="dxa" w:w="3969"/>
+            <w:tcW w:type="dxa" w:w="2948"/>
           </w:tcPr>
           <w:p>
             <w:r/>
@@ -3356,7 +3244,22 @@
                 <w:b w:val="0"/>
                 <w:sz w:val="18"/>
               </w:rPr>
-              <w:t>Wpisać 0% i dopisać zdanie z żółtego wariantu w komentarzu Środki trwałe (PRz nie amortyzuje wyników przekazywanych Liderowi).</w:t>
+              <w:t>Stawka amortyzacji prac rozwojowych (Środki trwałe C195, C196)</w:t>
+            </w:r>
+          </w:p>
+        </w:tc>
+        <w:tc>
+          <w:tcPr>
+            <w:tcW w:type="dxa" w:w="6350"/>
+          </w:tcPr>
+          <w:p>
+            <w:r/>
+            <w:r>
+              <w:rPr>
+                <w:b w:val="0"/>
+                <w:sz w:val="18"/>
+              </w:rPr>
+              <w:t>Wykonane: wpisane 0%. Komunikat „uzupełnij dane” zniknął, a w arkuszach wynikowych nie zmieniła się żadna liczba.</w:t>
             </w:r>
           </w:p>
         </w:tc>
@@ -3379,29 +3282,7 @@
         </w:tc>
         <w:tc>
           <w:tcPr>
-            <w:tcW w:type="dxa" w:w="5329"/>
-          </w:tcPr>
-          <w:p>
-            <w:r/>
-            <w:r>
-              <w:rPr>
-                <w:b/>
-                <w:sz w:val="18"/>
-              </w:rPr>
-              <w:t>Koszty dotychczasowej działalności są w jednej pozycji „łącznie z amortyzacją”.</w:t>
-            </w:r>
-            <w:r>
-              <w:rPr>
-                <w:b w:val="0"/>
-                <w:sz w:val="18"/>
-              </w:rPr>
-              <w:t xml:space="preserve"> Instrukcja dopuszcza jedną pozycję dla wszystkich kosztów z wyjątkiem amortyzacji. Skutek w liczbach jest zerowy (wynik i przepływy te same, majątek trwały stały), ale ekspert może to wytknąć.</w:t>
-            </w:r>
-          </w:p>
-        </w:tc>
-        <w:tc>
-          <w:tcPr>
-            <w:tcW w:type="dxa" w:w="3969"/>
+            <w:tcW w:type="dxa" w:w="2948"/>
           </w:tcPr>
           <w:p>
             <w:r/>
@@ -3410,7 +3291,22 @@
                 <w:b w:val="0"/>
                 <w:sz w:val="18"/>
               </w:rPr>
-              <w:t>Zostawić bez zmiany w liczbach. Komentarze to jawnie opisują. Zmiana wymagałaby wyodrębnienia amortyzacji z planu PRz (22 670 tys. zł w 2025 r.) i zmian w arkuszu Środki trwałe, co niesie więcej ryzyka niż pożytku.</w:t>
+              <w:t>Amortyzacja w jednej pozycji z pozostałymi kosztami</w:t>
+            </w:r>
+          </w:p>
+        </w:tc>
+        <w:tc>
+          <w:tcPr>
+            <w:tcW w:type="dxa" w:w="6350"/>
+          </w:tcPr>
+          <w:p>
+            <w:r/>
+            <w:r>
+              <w:rPr>
+                <w:b w:val="0"/>
+                <w:sz w:val="18"/>
+              </w:rPr>
+              <w:t>Niezmienione w liczbach, opisane z danymi PRz. Dane z załączników pozwalają podać amortyzację planu 2026 r. (26 546,6 tys. zł z 376 370,5 tys. zł), ale nie wystarczają do jej wyodrębnienia w modelu: brak podziału na grupy środków trwałych i brak amortyzacji na lata 2027-2029 (zestawienie PRz podaje tylko amortyzację równoważoną dochodem). Wyodrębnienie wymagałoby też wprowadzenia nakładów inwestycyjnych (plan 2026 r.: 60 152,2 tys. zł), bo inaczej model pokazałby przyrost środków pieniężnych o całą amortyzację. Komentarze jawnie opisują ten skutek (różnica ok. 33,6 mln zł rocznie; po jej uwzględnieniu płynność bieżąca ok. 2,5). Jeśli chcesz wyodrębnić amortyzację, potrzebuję od PRz podziału amortyzacji i nakładów na lata 2026-2029 według grup środków trwałych.</w:t>
             </w:r>
           </w:p>
         </w:tc>
@@ -3425,7 +3321,35 @@
         <w:rPr>
           <w:b w:val="0"/>
         </w:rPr>
-        <w:t>Potwierdzenia, które musi dać PRz (zaznaczone na żółto w tekstach):</w:t>
+        <w:t>Dwie rzeczy, które z załączników wynikły i są w komentarzach: po pierwsze, nasz wcześniejszy opis mechanizmu straty na sprzedaży (spadek stanu produktów) był błędny, bo w bilansie stan produktów wzrósł; po drugie, model pomija z planu 2026 r. koszty finansowe (160 tys. zł) i podatek (25 tys. zł), więc zysk netto w modelu (1 909 tys. zł) jest o 185 tys. zł wyższy od planu (1 724,9 tys. zł); to 0,05% przychodów i komentarz to podaje.</w:t>
+      </w:r>
+    </w:p>
+    <w:p>
+      <w:pPr>
+        <w:spacing w:after="60"/>
+      </w:pPr>
+      <w:r>
+        <w:rPr>
+          <w:b w:val="0"/>
+        </w:rPr>
+        <w:t>Potwierdzenia, które musi dać PRz (zaznaczone na żółto w tekstach; po jednym w każdym z trzech arkuszy):</w:t>
+      </w:r>
+    </w:p>
+    <w:p>
+      <w:pPr>
+        <w:pStyle w:val="ListBullet"/>
+      </w:pPr>
+      <w:r>
+        <w:rPr>
+          <w:b/>
+        </w:rPr>
+        <w:t>Najważniejsze, dla uwagi K6-17 (Sprawozdania finansowe):</w:t>
+      </w:r>
+      <w:r>
+        <w:rPr>
+          <w:b w:val="0"/>
+        </w:rPr>
+        <w:t xml:space="preserve"> co konkretnie składa się na zmianę stanu produktów minus 16 520 tys. zł w 2025 r. i minus 11 912 tys. zł w 2024 r. Z dokumentów wynika, że jest to pozycja stała i że nie odpowiada zmianie zapasów w bilansie, ale opis jej treści księgowej może dać tylko kwestor PRz. Bez tego odpowiedź na K6-17 jest poprawna co do liczb, a niepełna co do przyczyny.</w:t>
       </w:r>
     </w:p>
     <w:p>
@@ -3436,7 +3360,7 @@
         <w:rPr>
           <w:b w:val="0"/>
         </w:rPr>
-        <w:t>przyczyna ujemnej zmiany stanu produktów w 2025 r. (minus 16 520 tys. zł) i jej rodzaj (rozliczenie projektów i prac z lat wcześniejszych); to najważniejsze potwierdzenie dla uwagi K6-17, bo mechanizm opisałam na podstawie liczb ze sprawozdania i typowej praktyki uczelni, a nie dokumentu PRz,</w:t>
+        <w:t>co złożyło się na inne przychody operacyjne 2024 r. (23 988 tys. zł wobec 1 292 tys. zł w 2025 r.), bo to główna przyczyna spadku wyniku (Sprawozdania finansowe),</w:t>
       </w:r>
     </w:p>
     <w:p>
@@ -3447,7 +3371,7 @@
         <w:rPr>
           <w:b w:val="0"/>
         </w:rPr>
-        <w:t>podstawa prawna zwolnienia z CIT (art. 17 ust. 1 pkt 4 ustawy o CIT, jak w obecnym komentarzu PRz),</w:t>
+        <w:t>podstawa prawna zwolnienia z CIT (art. 17 ust. 1 pkt 4 ustawy o CIT, jak w poprzednim komentarzu PRz; Założenia),</w:t>
       </w:r>
     </w:p>
     <w:p>
@@ -3458,40 +3382,7 @@
         <w:rPr>
           <w:b w:val="0"/>
         </w:rPr>
-        <w:t>numer i data uchwały zatwierdzającej plan finansowo-rzeczowy na 2026 r. oraz potwierdzenie, że plan kosztów 376 371 tys. zł zawiera amortyzację, pozostałe koszty operacyjne i finansowe,</w:t>
-      </w:r>
-    </w:p>
-    <w:p>
-      <w:pPr>
-        <w:pStyle w:val="ListBullet"/>
-      </w:pPr>
-      <w:r>
-        <w:rPr>
-          <w:b w:val="0"/>
-        </w:rPr>
-        <w:t>struktura przychodów 2025 r. (subwencja, dotacje, opłaty za kształcenie, projekty, odsetki) i udział przychodów z zagranicy,</w:t>
-      </w:r>
-    </w:p>
-    <w:p>
-      <w:pPr>
-        <w:pStyle w:val="ListBullet"/>
-      </w:pPr>
-      <w:r>
-        <w:rPr>
-          <w:b w:val="0"/>
-        </w:rPr>
-        <w:t>tryb i termin odzyskania VAT 33 971 zł od aparatury oraz potwierdzenie, że stawki godzinowe w budżecie obejmują składki pracodawcy,</w:t>
-      </w:r>
-    </w:p>
-    <w:p>
-      <w:pPr>
-        <w:pStyle w:val="ListBullet"/>
-      </w:pPr>
-      <w:r>
-        <w:rPr>
-          <w:b w:val="0"/>
-        </w:rPr>
-        <w:t>struktura rozliczeń z odbiorcami, która tłumaczy niską rotację należności (3 dni).</w:t>
+        <w:t>tryb i termin odzyskania VAT 33 971 zł od aparatury oraz czy stawki godzinowe w budżecie obejmują składki pracodawcy (Finansowanie, Koszty operacyjne).</w:t>
       </w:r>
     </w:p>
     <w:p>

</xml_diff>

<commit_message>
Komentarze PRz: podstawa jednorazowego odpisu wg polityki PRz; usunięta błędna uwaga o progu 10 tys. zł
Co-Authored-By: Claude Sonnet 5.5 <noreply@anthropic.com>
Claude-Session: https://claude.ai/code/session_01672WnJhixnEcarbb7uiwfx
</commit_message>
<xml_diff>
--- a/Komentarze_model_finansowy_PRz.docx
+++ b/Komentarze_model_finansowy_PRz.docx
@@ -2511,7 +2511,7 @@
           <w:color w:val="666666"/>
           <w:sz w:val="17"/>
         </w:rPr>
-        <w:t xml:space="preserve"> [6692 znaków]</w:t>
+        <w:t xml:space="preserve"> [6865 znaków]</w:t>
       </w:r>
     </w:p>
     <w:p>
@@ -2579,7 +2579,7 @@
         <w:rPr>
           <w:b w:val="0"/>
         </w:rPr>
-        <w:t>2) Aparatura badawcza (amortyzacja): 147 700,00 zł netto, w całości kwalifikowalna ze 100% dofinansowaniem. Zakup jest zaplanowany w pierwszym półroczu 2027 r. dla zadań Z1 i Z3 (sprzęt do zadania Z1 od miesiąca M4, do zadania Z3 od miesiąca M6). Każdy składnik ma wartość początkową do 10 tys. zł netto, więc zgodnie z ustawą o rachunkowości i polityką rachunkowości PRz jest odpisywany jednorazowo w miesiącu oddania do używania (stawka roczna 100%, okres amortyzacji 1 miesiąc, jak w opisach kosztów w pkt 3.1 wniosku), co w skutkach odpowiada uwadze 1 do arkusza Środki trwałe w Instrukcji (środki trwałe poniżej 10 tys. zł amortyzuje się jednorazowo w roku zakupu). Dlatego cała wartość 147 700 zł jest kosztem 2027 r. Ujęto ją w pozycji Zużycie materiałów i energii (Projekt), a nie w tabeli amortyzacji arkusza Środki trwałe, co daje ten sam wynik w rachunku zysków i strat, w przepływach i w dofinansowaniu (zob. komentarz do arkusza Środki trwałe). Aparatura będzie używana wyłącznie w projekcie, a po jego zakończeniu zostanie zlikwidowana protokołem likwidacji. Podatek VAT od aparatury (33 971 zł) nie jest kosztem kwalifikowalnym i jest pokrywany ze środków własnych PRz (zob. komentarz do arkusza Finansowanie).</w:t>
+        <w:t>2) Aparatura badawcza (amortyzacja): 147 700,00 zł netto, w całości kwalifikowalna ze 100% dofinansowaniem. Zakup jest zaplanowany w pierwszym półroczu 2027 r. dla zadań Z1 i Z3 (sprzęt do zadania Z1 od miesiąca M4, do zadania Z3 od miesiąca M6). Każdy składnik ma wartość początkową do 10 tys. zł netto, więc zgodnie z polityką rachunkowości PRz (składniki o wartości do 10 000 zł ujmuje się w ewidencji środków trwałych, ale ich wartość odpisuje się jednorazowo w koszty z chwilą wydania do używania; zasady opisane w sprawozdaniu za 2025 r.) jest odpisywany jednorazowo w miesiącu oddania do używania (stawka roczna 100%, okres amortyzacji 1 miesiąc, jak w opisach kosztów w pkt 3.1 wniosku), co w skutkach odpowiada uwadze 1 do arkusza Środki trwałe w Instrukcji (środki trwałe poniżej 10 tys. zł amortyzuje się jednorazowo w roku zakupu). Dlatego cała wartość 147 700 zł jest kosztem 2027 r. Ujęto ją w pozycji Zużycie materiałów i energii (Projekt), a nie w tabeli amortyzacji arkusza Środki trwałe, co daje ten sam wynik w rachunku zysków i strat, w przepływach i w dofinansowaniu (zob. komentarz do arkusza Środki trwałe). Aparatura będzie używana wyłącznie w projekcie, a po jego zakończeniu zostanie zlikwidowana protokołem likwidacji. Podatek VAT od aparatury (33 971 zł) nie jest kosztem kwalifikowalnym i jest pokrywany ze środków własnych PRz (zob. komentarz do arkusza Finansowanie).</w:t>
       </w:r>
     </w:p>
     <w:p>
@@ -2629,7 +2629,7 @@
           <w:color w:val="666666"/>
           <w:sz w:val="17"/>
         </w:rPr>
-        <w:t xml:space="preserve"> [3734 znaków]</w:t>
+        <w:t xml:space="preserve"> [3807 znaków]</w:t>
       </w:r>
     </w:p>
     <w:p>
@@ -2651,7 +2651,7 @@
         <w:rPr>
           <w:b w:val="0"/>
         </w:rPr>
-        <w:t>Środki trwałe Projektu. Aparaturę badawczą o wartości 147 700 zł netto (zakup w pierwszym półroczu 2027 r. dla zadań Z1 i Z3) PRz odpisuje jednorazowo w miesiącu oddania do używania, ponieważ każdy składnik ma wartość początkową do 10 tys. zł netto (ustawa o rachunkowości i polityka rachunkowości PRz; w skutkach jest to zgodne z uwagą 1 do arkusza Środki trwałe w Instrukcji, według której środki trwałe poniżej 10 tys. zł są amortyzowane jednorazowo w roku zakupu). Z tego powodu aparatury nie wprowadzono do tabel zakupu, bo jej wartość w całości jest kosztem roku 2027, a dofinansowanie dotyczy amortyzacji (przypisy do Instrukcji: w projektach B+R dofinansowanie dotyczy wyłącznie amortyzacji środków trwałych). Pozycję ujęto w arkuszu Koszty operacyjne, w pozycji Zużycie materiałów i energii (Projekt), w kwocie 148 tys. zł w 2027 r. jako koszt kwalifikowalny ze 100% dofinansowaniem. Wynik jest taki sam, jak po wpisaniu aparatury do tabeli z jednorazową amortyzacją: koszt 2027 r. wynosi 147,7 tys. zł, dofinansowanie 147,7 tys. zł, a wartość księgowa netto na koniec 2027 r. jest równa zero. Po zakończeniu projektu aparatura zostanie zlikwidowana protokołem likwidacji, więc nie pozostaje w majątku PRz. Podatek VAT od aparatury (33 971 zł) opisano w komentarzu do arkusza Finansowanie.</w:t>
+        <w:t>Środki trwałe Projektu. Aparaturę badawczą o wartości 147 700 zł netto (zakup w pierwszym półroczu 2027 r. dla zadań Z1 i Z3) PRz odpisuje jednorazowo w miesiącu oddania do używania, ponieważ każdy składnik ma wartość początkową do 10 tys. zł netto (polityka rachunkowości PRz: składniki o wartości do 10 000 zł odpisuje się jednorazowo w koszty z chwilą wydania do używania; w skutkach jest to zgodne z uwagą 1 do arkusza Środki trwałe w Instrukcji, według której środki trwałe poniżej 10 tys. zł są amortyzowane jednorazowo w roku zakupu). Z tego powodu aparatury nie wprowadzono do tabel zakupu, bo jej wartość w całości jest kosztem roku 2027, a dofinansowanie dotyczy amortyzacji (przypisy do Instrukcji: w projektach B+R dofinansowanie dotyczy wyłącznie amortyzacji środków trwałych). Pozycję ujęto w arkuszu Koszty operacyjne, w pozycji Zużycie materiałów i energii (Projekt), w kwocie 148 tys. zł w 2027 r. jako koszt kwalifikowalny ze 100% dofinansowaniem. Wynik jest taki sam, jak po wpisaniu aparatury do tabeli z jednorazową amortyzacją: koszt 2027 r. wynosi 147,7 tys. zł, dofinansowanie 147,7 tys. zł, a wartość księgowa netto na koniec 2027 r. jest równa zero. Po zakończeniu projektu aparatura zostanie zlikwidowana protokołem likwidacji, więc nie pozostaje w majątku PRz. Podatek VAT od aparatury (33 971 zł) opisano w komentarzu do arkusza Finansowanie.</w:t>
       </w:r>
     </w:p>
     <w:p>
@@ -3385,17 +3385,6 @@
         <w:t>tryb i termin odzyskania VAT 33 971 zł od aparatury oraz czy stawki godzinowe w budżecie obejmują składki pracodawcy (Finansowanie, Koszty operacyjne).</w:t>
       </w:r>
     </w:p>
-    <w:p>
-      <w:pPr>
-        <w:spacing w:after="60"/>
-      </w:pPr>
-      <w:r>
-        <w:rPr>
-          <w:b w:val="0"/>
-        </w:rPr>
-        <w:t>Pozycje aparatury o wartości dokładnie 10 000 zł netto (wniosek, pkt 3.1: zestaw kamery ToF typ 2 i uchwyty z obudowami typ 2) nie są „poniżej 10 tys. zł”, o którym mówi Instrukcja, ale wniosek podaje jako podstawę odpisu jednorazowego ustawę o rachunkowości i politykę rachunkowości PRz. Dlatego w komentarzach użyłam sformułowania „do 10 tys. zł” i powołałam się na politykę rachunkowości, a Instrukcję tylko jako zgodną w skutkach.</w:t>
-      </w:r>
-    </w:p>
     <w:sectPr>
       <w:pgSz w:w="11906" w:h="16838"/>
       <w:pgMar w:top="1134" w:right="1134" w:bottom="1134" w:left="1134" w:header="720" w:footer="720" w:gutter="0"/>

</xml_diff>